<commit_message>
Enhance final study guide with full instructor transcript insights
Expand OA cheat sheet and cohort highlights with IGR vs SGR, Excel
rules, valuation cues, DuPont/ROA distinction, and exam traps.

Co-authored-by: Bradley Galindo <Brad-Galindo@users.noreply.github.com>
</commit_message>
<xml_diff>
--- a/D076-Finance-Skills-for-Managers/final/D076-COMPLETE-STUDY-GUIDE.docx
+++ b/D076-Finance-Skills-for-Managers/final/D076-COMPLETE-STUDY-GUIDE.docx
@@ -20,7 +20,7 @@
       </w:r>
     </w:p>
     <w:bookmarkEnd w:id="20"/>
-    <w:bookmarkStart w:id="33" w:name="complete-study-guide-pass-focused"/>
+    <w:bookmarkStart w:id="34" w:name="complete-study-guide-pass-focused"/>
     <w:p>
       <w:pPr>
         <w:pStyle w:val="Heading1"/>
@@ -115,7 +115,7 @@
         </w:pict>
       </w:r>
     </w:p>
-    <w:bookmarkStart w:id="27" w:name="oa-decision-cheat-sheet-memorize-first"/>
+    <w:bookmarkStart w:id="28" w:name="oa-decision-cheat-sheet-memorize-first"/>
     <w:p>
       <w:pPr>
         <w:pStyle w:val="Heading2"/>
@@ -260,7 +260,7 @@
               <w:jc w:val="left"/>
             </w:pPr>
             <w:r>
-              <w:t xml:space="preserve">Limited capital; rank several projects</w:t>
+              <w:t xml:space="preserve">Limited capital; rank several projects / different upfront costs</w:t>
             </w:r>
           </w:p>
         </w:tc>
@@ -318,7 +318,7 @@
               <w:t xml:space="preserve"> </w:t>
             </w:r>
             <w:r>
-              <w:t xml:space="preserve">/ easy story</w:t>
+              <w:t xml:space="preserve">/ easy story / screening</w:t>
             </w:r>
           </w:p>
         </w:tc>
@@ -390,6 +390,36 @@
               <w:jc w:val="left"/>
             </w:pPr>
             <w:r>
+              <w:t xml:space="preserve">NPV vs IRR conflict</w:t>
+            </w:r>
+          </w:p>
+        </w:tc>
+        <w:tc>
+          <w:tcPr/>
+          <w:p>
+            <w:pPr>
+              <w:pStyle w:val="Compact"/>
+              <w:jc w:val="left"/>
+            </w:pPr>
+            <w:r>
+              <w:rPr>
+                <w:bCs/>
+                <w:b/>
+              </w:rPr>
+              <w:t xml:space="preserve">Trust NPV</w:t>
+            </w:r>
+          </w:p>
+        </w:tc>
+      </w:tr>
+      <w:tr>
+        <w:tc>
+          <w:tcPr/>
+          <w:p>
+            <w:pPr>
+              <w:pStyle w:val="Compact"/>
+              <w:jc w:val="left"/>
+            </w:pPr>
+            <w:r>
               <w:t xml:space="preserve">Accept NPV</w:t>
             </w:r>
           </w:p>
@@ -583,6 +613,138 @@
                 <w:b/>
               </w:rPr>
               <w:t xml:space="preserve">IRR</w:t>
+            </w:r>
+          </w:p>
+        </w:tc>
+      </w:tr>
+      <w:tr>
+        <w:tc>
+          <w:tcPr/>
+          <w:p>
+            <w:pPr>
+              <w:pStyle w:val="Compact"/>
+              <w:jc w:val="left"/>
+            </w:pPr>
+            <w:r>
+              <w:t xml:space="preserve">Preferred stock valuation</w:t>
+            </w:r>
+          </w:p>
+        </w:tc>
+        <w:tc>
+          <w:tcPr/>
+          <w:p>
+            <w:pPr>
+              <w:pStyle w:val="Compact"/>
+              <w:jc w:val="left"/>
+            </w:pPr>
+            <w:r>
+              <w:rPr>
+                <w:bCs/>
+                <w:b/>
+              </w:rPr>
+              <w:t xml:space="preserve">Perpetuity</w:t>
+            </w:r>
+            <w:r>
+              <w:t xml:space="preserve"> </w:t>
+            </w:r>
+            <w:r>
+              <w:t xml:space="preserve">(fixed dividend forever)</w:t>
+            </w:r>
+          </w:p>
+        </w:tc>
+      </w:tr>
+      <w:tr>
+        <w:tc>
+          <w:tcPr/>
+          <w:p>
+            <w:pPr>
+              <w:pStyle w:val="Compact"/>
+              <w:jc w:val="left"/>
+            </w:pPr>
+            <w:r>
+              <w:t xml:space="preserve">Common stock valuation</w:t>
+            </w:r>
+          </w:p>
+        </w:tc>
+        <w:tc>
+          <w:tcPr/>
+          <w:p>
+            <w:pPr>
+              <w:pStyle w:val="Compact"/>
+              <w:jc w:val="left"/>
+            </w:pPr>
+            <w:r>
+              <w:rPr>
+                <w:bCs/>
+                <w:b/>
+              </w:rPr>
+              <w:t xml:space="preserve">Constant growth / Gordon model</w:t>
+            </w:r>
+          </w:p>
+        </w:tc>
+      </w:tr>
+      <w:tr>
+        <w:tc>
+          <w:tcPr/>
+          <w:p>
+            <w:pPr>
+              <w:pStyle w:val="Compact"/>
+              <w:jc w:val="left"/>
+            </w:pPr>
+            <w:r>
+              <w:t xml:space="preserve">Bond valuation</w:t>
+            </w:r>
+          </w:p>
+        </w:tc>
+        <w:tc>
+          <w:tcPr/>
+          <w:p>
+            <w:pPr>
+              <w:pStyle w:val="Compact"/>
+              <w:jc w:val="left"/>
+            </w:pPr>
+            <w:r>
+              <w:rPr>
+                <w:bCs/>
+                <w:b/>
+              </w:rPr>
+              <w:t xml:space="preserve">PV of coupons + principal</w:t>
+            </w:r>
+            <w:r>
+              <w:t xml:space="preserve"> </w:t>
+            </w:r>
+            <w:r>
+              <w:t xml:space="preserve">(Excel PV)</w:t>
+            </w:r>
+          </w:p>
+        </w:tc>
+      </w:tr>
+      <w:tr>
+        <w:tc>
+          <w:tcPr/>
+          <w:p>
+            <w:pPr>
+              <w:pStyle w:val="Compact"/>
+              <w:jc w:val="left"/>
+            </w:pPr>
+            <w:r>
+              <w:t xml:space="preserve">Intrinsic &gt; market price</w:t>
+            </w:r>
+          </w:p>
+        </w:tc>
+        <w:tc>
+          <w:tcPr/>
+          <w:p>
+            <w:pPr>
+              <w:pStyle w:val="Compact"/>
+              <w:jc w:val="left"/>
+            </w:pPr>
+            <w:r>
+              <w:rPr>
+                <w:bCs/>
+                <w:b/>
+              </w:rPr>
+              <w:t xml:space="preserve">Undervalued / underpriced</w:t>
             </w:r>
           </w:p>
         </w:tc>
@@ -601,13 +763,13 @@
     <w:tbl>
       <w:tblPr>
         <w:tblStyle w:val="Table"/>
-        <w:tblW w:type="auto" w:w="0"/>
+        <w:tblW w:type="pct" w:w="5000"/>
         <w:tblLook w:firstRow="1" w:lastRow="0" w:firstColumn="0" w:lastColumn="0" w:noHBand="0" w:noVBand="0" w:val="0020"/>
         <w:jc w:val="start"/>
       </w:tblPr>
       <w:tblGrid>
-        <w:gridCol w:w="3960"/>
-        <w:gridCol w:w="3960"/>
+        <w:gridCol w:w="2160"/>
+        <w:gridCol w:w="5760"/>
       </w:tblGrid>
       <w:tr>
         <w:trPr>
@@ -775,7 +937,7 @@
               <w:t xml:space="preserve"> </w:t>
             </w:r>
             <w:r>
-              <w:t xml:space="preserve">(cash flows only)</w:t>
+              <w:t xml:space="preserve">(cash flows only; include year 0)</w:t>
             </w:r>
           </w:p>
         </w:tc>
@@ -813,6 +975,24 @@
               </w:rPr>
               <w:t xml:space="preserve">0</w:t>
             </w:r>
+            <w:r>
+              <w:t xml:space="preserve"> </w:t>
+            </w:r>
+            <w:r>
+              <w:t xml:space="preserve">(</w:t>
+            </w:r>
+            <w:r>
+              <w:t xml:space="preserve">“</w:t>
+            </w:r>
+            <w:r>
+              <w:t xml:space="preserve">Ordinary → 0</w:t>
+            </w:r>
+            <w:r>
+              <w:t xml:space="preserve">”</w:t>
+            </w:r>
+            <w:r>
+              <w:t xml:space="preserve">)</w:t>
+            </w:r>
           </w:p>
         </w:tc>
       </w:tr>
@@ -849,6 +1029,24 @@
               </w:rPr>
               <w:t xml:space="preserve">1</w:t>
             </w:r>
+            <w:r>
+              <w:t xml:space="preserve"> </w:t>
+            </w:r>
+            <w:r>
+              <w:t xml:space="preserve">(</w:t>
+            </w:r>
+            <w:r>
+              <w:t xml:space="preserve">“</w:t>
+            </w:r>
+            <w:r>
+              <w:t xml:space="preserve">starting today</w:t>
+            </w:r>
+            <w:r>
+              <w:t xml:space="preserve">”</w:t>
+            </w:r>
+            <w:r>
+              <w:t xml:space="preserve">)</w:t>
+            </w:r>
           </w:p>
         </w:tc>
       </w:tr>
@@ -915,7 +1113,124 @@
               <w:t xml:space="preserve"> </w:t>
             </w:r>
             <w:r>
-              <w:t xml:space="preserve">PMT</w:t>
+              <w:t xml:space="preserve">PMT/PV</w:t>
+            </w:r>
+          </w:p>
+        </w:tc>
+      </w:tr>
+      <w:tr>
+        <w:tc>
+          <w:tcPr/>
+          <w:p>
+            <w:pPr>
+              <w:pStyle w:val="Compact"/>
+              <w:jc w:val="left"/>
+            </w:pPr>
+            <w:r>
+              <w:t xml:space="preserve">Unused inputs</w:t>
+            </w:r>
+          </w:p>
+        </w:tc>
+        <w:tc>
+          <w:tcPr/>
+          <w:p>
+            <w:pPr>
+              <w:pStyle w:val="Compact"/>
+              <w:jc w:val="left"/>
+            </w:pPr>
+            <w:r>
+              <w:t xml:space="preserve">Put</w:t>
+            </w:r>
+            <w:r>
+              <w:t xml:space="preserve"> </w:t>
+            </w:r>
+            <w:r>
+              <w:rPr>
+                <w:bCs/>
+                <w:b/>
+              </w:rPr>
+              <w:t xml:space="preserve">0</w:t>
+            </w:r>
+            <w:r>
+              <w:t xml:space="preserve"> </w:t>
+            </w:r>
+            <w:r>
+              <w:t xml:space="preserve">— never leave blank</w:t>
+            </w:r>
+          </w:p>
+        </w:tc>
+      </w:tr>
+      <w:tr>
+        <w:tc>
+          <w:tcPr/>
+          <w:p>
+            <w:pPr>
+              <w:pStyle w:val="Compact"/>
+              <w:jc w:val="left"/>
+            </w:pPr>
+            <w:r>
+              <w:t xml:space="preserve">Formulas</w:t>
+            </w:r>
+          </w:p>
+        </w:tc>
+        <w:tc>
+          <w:tcPr/>
+          <w:p>
+            <w:pPr>
+              <w:pStyle w:val="Compact"/>
+              <w:jc w:val="left"/>
+            </w:pPr>
+            <w:r>
+              <w:t xml:space="preserve">Use</w:t>
+            </w:r>
+            <w:r>
+              <w:t xml:space="preserve"> </w:t>
+            </w:r>
+            <w:r>
+              <w:rPr>
+                <w:bCs/>
+                <w:b/>
+              </w:rPr>
+              <w:t xml:space="preserve">cell references</w:t>
+            </w:r>
+            <w:r>
+              <w:t xml:space="preserve">, not typed numbers</w:t>
+            </w:r>
+          </w:p>
+        </w:tc>
+      </w:tr>
+      <w:tr>
+        <w:tc>
+          <w:tcPr/>
+          <w:p>
+            <w:pPr>
+              <w:pStyle w:val="Compact"/>
+              <w:jc w:val="left"/>
+            </w:pPr>
+            <w:r>
+              <w:t xml:space="preserve">TYPE applies to</w:t>
+            </w:r>
+          </w:p>
+        </w:tc>
+        <w:tc>
+          <w:tcPr/>
+          <w:p>
+            <w:pPr>
+              <w:pStyle w:val="Compact"/>
+              <w:jc w:val="left"/>
+            </w:pPr>
+            <w:r>
+              <w:rPr>
+                <w:bCs/>
+                <w:b/>
+              </w:rPr>
+              <w:t xml:space="preserve">Pmt timing only</w:t>
+            </w:r>
+            <w:r>
+              <w:t xml:space="preserve"> </w:t>
+            </w:r>
+            <w:r>
+              <w:t xml:space="preserve">(not PV/FV)</w:t>
             </w:r>
           </w:p>
         </w:tc>
@@ -992,7 +1307,7 @@
               <w:jc w:val="left"/>
             </w:pPr>
             <w:r>
-              <w:t xml:space="preserve">Vary with sales (COGS, cash, AR, inventory, AP)</w:t>
+              <w:t xml:space="preserve">Vary with sales (COGS, cash, AR, inventory, AP, accruals)</w:t>
             </w:r>
           </w:p>
         </w:tc>
@@ -1018,33 +1333,69 @@
               <w:jc w:val="left"/>
             </w:pPr>
             <w:r>
-              <w:t xml:space="preserve">Management choice (notes payable, LT debt, common stock)</w:t>
-            </w:r>
-          </w:p>
-        </w:tc>
-      </w:tr>
-      <w:tr>
-        <w:tc>
-          <w:tcPr/>
-          <w:p>
-            <w:pPr>
-              <w:pStyle w:val="Compact"/>
-              <w:jc w:val="left"/>
-            </w:pPr>
-            <w:r>
-              <w:t xml:space="preserve">DFN</w:t>
-            </w:r>
-          </w:p>
-        </w:tc>
-        <w:tc>
-          <w:tcPr/>
-          <w:p>
-            <w:pPr>
-              <w:pStyle w:val="Compact"/>
-              <w:jc w:val="left"/>
-            </w:pPr>
-            <w:r>
-              <w:t xml:space="preserve">Proj Assets − Proj Liab − Proj Equity (after pro formas)</w:t>
+              <w:t xml:space="preserve">Management choice (notes payable, LT debt, common stock) —</w:t>
+            </w:r>
+            <w:r>
+              <w:t xml:space="preserve"> </w:t>
+            </w:r>
+            <w:r>
+              <w:rPr>
+                <w:bCs/>
+                <w:b/>
+              </w:rPr>
+              <w:t xml:space="preserve">do NOT auto-scale with sales</w:t>
+            </w:r>
+          </w:p>
+        </w:tc>
+      </w:tr>
+      <w:tr>
+        <w:tc>
+          <w:tcPr/>
+          <w:p>
+            <w:pPr>
+              <w:pStyle w:val="Compact"/>
+              <w:jc w:val="left"/>
+            </w:pPr>
+            <w:r>
+              <w:t xml:space="preserve">DFN / AFN / EFN</w:t>
+            </w:r>
+          </w:p>
+        </w:tc>
+        <w:tc>
+          <w:tcPr/>
+          <w:p>
+            <w:pPr>
+              <w:pStyle w:val="Compact"/>
+              <w:jc w:val="left"/>
+            </w:pPr>
+            <w:r>
+              <w:t xml:space="preserve">Same idea: Proj Assets − Proj Liab − Proj Equity (after pro formas)</w:t>
+            </w:r>
+          </w:p>
+        </w:tc>
+      </w:tr>
+      <w:tr>
+        <w:tc>
+          <w:tcPr/>
+          <w:p>
+            <w:pPr>
+              <w:pStyle w:val="Compact"/>
+              <w:jc w:val="left"/>
+            </w:pPr>
+            <w:r>
+              <w:t xml:space="preserve">DFN &gt; 0</w:t>
+            </w:r>
+          </w:p>
+        </w:tc>
+        <w:tc>
+          <w:tcPr/>
+          <w:p>
+            <w:pPr>
+              <w:pStyle w:val="Compact"/>
+              <w:jc w:val="left"/>
+            </w:pPr>
+            <w:r>
+              <w:t xml:space="preserve">Need external financing</w:t>
             </w:r>
           </w:p>
         </w:tc>
@@ -1070,7 +1421,7 @@
               <w:jc w:val="left"/>
             </w:pPr>
             <w:r>
-              <w:t xml:space="preserve">Enough financing already</w:t>
+              <w:t xml:space="preserve">Surplus / enough financing already</w:t>
             </w:r>
           </w:p>
         </w:tc>
@@ -1096,7 +1447,7 @@
               <w:jc w:val="left"/>
             </w:pPr>
             <w:r>
-              <w:t xml:space="preserve">↑ plowback/retention, ↑ net margin; check</w:t>
+              <w:t xml:space="preserve">↑ plowback/retention, ↑ net margin, slow growth, use idle capacity, outsource; check</w:t>
             </w:r>
             <w:r>
               <w:t xml:space="preserve"> </w:t>
@@ -1126,6 +1477,10 @@
               <w:jc w:val="left"/>
             </w:pPr>
             <w:r>
+              <w:rPr>
+                <w:bCs/>
+                <w:b/>
+              </w:rPr>
               <w:t xml:space="preserve">SGR</w:t>
             </w:r>
           </w:p>
@@ -1151,7 +1506,56 @@
               <w:t xml:space="preserve">new equity</w:t>
             </w:r>
             <w:r>
-              <w:t xml:space="preserve">; ↑ SGR by ↓ dividends / ↑ retention</w:t>
+              <w:t xml:space="preserve"> </w:t>
+            </w:r>
+            <w:r>
+              <w:t xml:space="preserve">(debt OK at constant D/E); ↑ by ↓ dividends / ↑ ROE levers</w:t>
+            </w:r>
+          </w:p>
+        </w:tc>
+      </w:tr>
+      <w:tr>
+        <w:tc>
+          <w:tcPr/>
+          <w:p>
+            <w:pPr>
+              <w:pStyle w:val="Compact"/>
+              <w:jc w:val="left"/>
+            </w:pPr>
+            <w:r>
+              <w:rPr>
+                <w:bCs/>
+                <w:b/>
+              </w:rPr>
+              <w:t xml:space="preserve">IGR</w:t>
+            </w:r>
+          </w:p>
+        </w:tc>
+        <w:tc>
+          <w:tcPr/>
+          <w:p>
+            <w:pPr>
+              <w:pStyle w:val="Compact"/>
+              <w:jc w:val="left"/>
+            </w:pPr>
+            <w:r>
+              <w:t xml:space="preserve">Grow with</w:t>
+            </w:r>
+            <w:r>
+              <w:t xml:space="preserve"> </w:t>
+            </w:r>
+            <w:r>
+              <w:rPr>
+                <w:bCs/>
+                <w:b/>
+              </w:rPr>
+              <w:t xml:space="preserve">no new debt and no new equity</w:t>
+            </w:r>
+            <w:r>
+              <w:t xml:space="preserve"> </w:t>
+            </w:r>
+            <w:r>
+              <w:t xml:space="preserve">(RE only) — SGR &gt; IGR</w:t>
             </w:r>
           </w:p>
         </w:tc>
@@ -1187,7 +1591,82 @@
               <w:t xml:space="preserve"> </w:t>
             </w:r>
             <w:r>
-              <w:t xml:space="preserve">— buy whole factory, not a fraction</w:t>
+              <w:t xml:space="preserve">— buy whole factory/machine; only add when</w:t>
+            </w:r>
+            <w:r>
+              <w:t xml:space="preserve"> </w:t>
+            </w:r>
+            <w:r>
+              <w:rPr>
+                <w:bCs/>
+                <w:b/>
+              </w:rPr>
+              <w:t xml:space="preserve">over capacity</w:t>
+            </w:r>
+          </w:p>
+        </w:tc>
+      </w:tr>
+      <w:tr>
+        <w:tc>
+          <w:tcPr/>
+          <w:p>
+            <w:pPr>
+              <w:pStyle w:val="Compact"/>
+              <w:jc w:val="left"/>
+            </w:pPr>
+            <w:r>
+              <w:t xml:space="preserve">Sales capacity</w:t>
+            </w:r>
+          </w:p>
+        </w:tc>
+        <w:tc>
+          <w:tcPr/>
+          <w:p>
+            <w:pPr>
+              <w:pStyle w:val="Compact"/>
+              <w:jc w:val="left"/>
+            </w:pPr>
+            <w:r>
+              <w:t xml:space="preserve">Actual sales ÷ capacity utilization %</w:t>
+            </w:r>
+          </w:p>
+        </w:tc>
+      </w:tr>
+      <w:tr>
+        <w:tc>
+          <w:tcPr/>
+          <w:p>
+            <w:pPr>
+              <w:pStyle w:val="Compact"/>
+              <w:jc w:val="left"/>
+            </w:pPr>
+            <w:r>
+              <w:t xml:space="preserve">Retained earnings</w:t>
+            </w:r>
+          </w:p>
+        </w:tc>
+        <w:tc>
+          <w:tcPr/>
+          <w:p>
+            <w:pPr>
+              <w:pStyle w:val="Compact"/>
+              <w:jc w:val="left"/>
+            </w:pPr>
+            <w:r>
+              <w:t xml:space="preserve">NI − dividends (</w:t>
+            </w:r>
+            <w:r>
+              <w:rPr>
+                <w:bCs/>
+                <w:b/>
+              </w:rPr>
+              <w:t xml:space="preserve">not</w:t>
+            </w:r>
+            <w:r>
+              <w:t xml:space="preserve"> </w:t>
+            </w:r>
+            <w:r>
+              <w:t xml:space="preserve">a simple % of sales)</w:t>
             </w:r>
           </w:p>
         </w:tc>
@@ -1201,469 +1680,6 @@
       </w:pPr>
       <w:r>
         <w:t xml:space="preserve">Ratios &amp; DuPont (Unit 4)</w:t>
-      </w:r>
-    </w:p>
-    <w:tbl>
-      <w:tblPr>
-        <w:tblStyle w:val="Table"/>
-        <w:tblW w:type="auto" w:w="0"/>
-        <w:tblLook w:firstRow="1" w:lastRow="0" w:firstColumn="0" w:lastColumn="0" w:noHBand="0" w:noVBand="0" w:val="0020"/>
-        <w:jc w:val="start"/>
-      </w:tblPr>
-      <w:tblGrid>
-        <w:gridCol w:w="3960"/>
-        <w:gridCol w:w="3960"/>
-      </w:tblGrid>
-      <w:tr>
-        <w:trPr>
-          <w:tblHeader w:val="true"/>
-        </w:trPr>
-        <w:tc>
-          <w:tcPr/>
-          <w:p>
-            <w:pPr>
-              <w:pStyle w:val="Compact"/>
-              <w:jc w:val="left"/>
-            </w:pPr>
-            <w:r>
-              <w:t xml:space="preserve">Idea</w:t>
-            </w:r>
-          </w:p>
-        </w:tc>
-        <w:tc>
-          <w:tcPr/>
-          <w:p>
-            <w:pPr>
-              <w:pStyle w:val="Compact"/>
-              <w:jc w:val="left"/>
-            </w:pPr>
-            <w:r>
-              <w:t xml:space="preserve">Rule</w:t>
-            </w:r>
-          </w:p>
-        </w:tc>
-      </w:tr>
-      <w:tr>
-        <w:tc>
-          <w:tcPr/>
-          <w:p>
-            <w:pPr>
-              <w:pStyle w:val="Compact"/>
-              <w:jc w:val="left"/>
-            </w:pPr>
-            <w:r>
-              <w:t xml:space="preserve">Suppliers / ST creditors care about</w:t>
-            </w:r>
-          </w:p>
-        </w:tc>
-        <w:tc>
-          <w:tcPr/>
-          <w:p>
-            <w:pPr>
-              <w:pStyle w:val="Compact"/>
-              <w:jc w:val="left"/>
-            </w:pPr>
-            <w:r>
-              <w:rPr>
-                <w:bCs/>
-                <w:b/>
-              </w:rPr>
-              <w:t xml:space="preserve">Liquidity</w:t>
-            </w:r>
-          </w:p>
-        </w:tc>
-      </w:tr>
-      <w:tr>
-        <w:tc>
-          <w:tcPr/>
-          <w:p>
-            <w:pPr>
-              <w:pStyle w:val="Compact"/>
-              <w:jc w:val="left"/>
-            </w:pPr>
-            <w:r>
-              <w:t xml:space="preserve">Quick vs current</w:t>
-            </w:r>
-          </w:p>
-        </w:tc>
-        <w:tc>
-          <w:tcPr/>
-          <w:p>
-            <w:pPr>
-              <w:pStyle w:val="Compact"/>
-              <w:jc w:val="left"/>
-            </w:pPr>
-            <w:r>
-              <w:t xml:space="preserve">Quick</w:t>
-            </w:r>
-            <w:r>
-              <w:t xml:space="preserve"> </w:t>
-            </w:r>
-            <w:r>
-              <w:rPr>
-                <w:bCs/>
-                <w:b/>
-              </w:rPr>
-              <w:t xml:space="preserve">excludes inventory</w:t>
-            </w:r>
-          </w:p>
-        </w:tc>
-      </w:tr>
-      <w:tr>
-        <w:tc>
-          <w:tcPr/>
-          <w:p>
-            <w:pPr>
-              <w:pStyle w:val="Compact"/>
-              <w:jc w:val="left"/>
-            </w:pPr>
-            <w:r>
-              <w:t xml:space="preserve">High inventory turnover vs peers</w:t>
-            </w:r>
-          </w:p>
-        </w:tc>
-        <w:tc>
-          <w:tcPr/>
-          <w:p>
-            <w:pPr>
-              <w:pStyle w:val="Compact"/>
-              <w:jc w:val="left"/>
-            </w:pPr>
-            <w:r>
-              <w:t xml:space="preserve">May mean</w:t>
-            </w:r>
-            <w:r>
-              <w:t xml:space="preserve"> </w:t>
-            </w:r>
-            <w:r>
-              <w:rPr>
-                <w:bCs/>
-                <w:b/>
-              </w:rPr>
-              <w:t xml:space="preserve">not enough inventory</w:t>
-            </w:r>
-          </w:p>
-        </w:tc>
-      </w:tr>
-      <w:tr>
-        <w:tc>
-          <w:tcPr/>
-          <w:p>
-            <w:pPr>
-              <w:pStyle w:val="Compact"/>
-              <w:jc w:val="left"/>
-            </w:pPr>
-            <w:r>
-              <w:t xml:space="preserve">ACP too high vs industry</w:t>
-            </w:r>
-          </w:p>
-        </w:tc>
-        <w:tc>
-          <w:tcPr/>
-          <w:p>
-            <w:pPr>
-              <w:pStyle w:val="Compact"/>
-              <w:jc w:val="left"/>
-            </w:pPr>
-            <w:r>
-              <w:rPr>
-                <w:bCs/>
-                <w:b/>
-              </w:rPr>
-              <w:t xml:space="preserve">Tighten credit standards</w:t>
-            </w:r>
-          </w:p>
-        </w:tc>
-      </w:tr>
-      <w:tr>
-        <w:tc>
-          <w:tcPr/>
-          <w:p>
-            <w:pPr>
-              <w:pStyle w:val="Compact"/>
-              <w:jc w:val="left"/>
-            </w:pPr>
-            <w:r>
-              <w:t xml:space="preserve">Debt ratio 40%</w:t>
-            </w:r>
-          </w:p>
-        </w:tc>
-        <w:tc>
-          <w:tcPr/>
-          <w:p>
-            <w:pPr>
-              <w:pStyle w:val="Compact"/>
-              <w:jc w:val="left"/>
-            </w:pPr>
-            <w:r>
-              <w:t xml:space="preserve">40% of</w:t>
-            </w:r>
-            <w:r>
-              <w:t xml:space="preserve"> </w:t>
-            </w:r>
-            <w:r>
-              <w:rPr>
-                <w:bCs/>
-                <w:b/>
-              </w:rPr>
-              <w:t xml:space="preserve">assets</w:t>
-            </w:r>
-            <w:r>
-              <w:t xml:space="preserve"> </w:t>
-            </w:r>
-            <w:r>
-              <w:t xml:space="preserve">financed by debt</w:t>
-            </w:r>
-          </w:p>
-        </w:tc>
-      </w:tr>
-      <w:tr>
-        <w:tc>
-          <w:tcPr/>
-          <w:p>
-            <w:pPr>
-              <w:pStyle w:val="Compact"/>
-              <w:jc w:val="left"/>
-            </w:pPr>
-            <w:r>
-              <w:t xml:space="preserve">Operating margin</w:t>
-            </w:r>
-          </w:p>
-        </w:tc>
-        <w:tc>
-          <w:tcPr/>
-          <w:p>
-            <w:pPr>
-              <w:pStyle w:val="Compact"/>
-              <w:jc w:val="left"/>
-            </w:pPr>
-            <w:r>
-              <w:t xml:space="preserve">Compare firms with different capital structures</w:t>
-            </w:r>
-          </w:p>
-        </w:tc>
-      </w:tr>
-      <w:tr>
-        <w:tc>
-          <w:tcPr/>
-          <w:p>
-            <w:pPr>
-              <w:pStyle w:val="Compact"/>
-              <w:jc w:val="left"/>
-            </w:pPr>
-            <w:r>
-              <w:t xml:space="preserve">Net margin 7%</w:t>
-            </w:r>
-          </w:p>
-        </w:tc>
-        <w:tc>
-          <w:tcPr/>
-          <w:p>
-            <w:pPr>
-              <w:pStyle w:val="Compact"/>
-              <w:jc w:val="left"/>
-            </w:pPr>
-            <w:r>
-              <w:t xml:space="preserve">7¢ per $1 sales for</w:t>
-            </w:r>
-            <w:r>
-              <w:t xml:space="preserve"> </w:t>
-            </w:r>
-            <w:r>
-              <w:rPr>
-                <w:bCs/>
-                <w:b/>
-              </w:rPr>
-              <w:t xml:space="preserve">equity holders</w:t>
-            </w:r>
-          </w:p>
-        </w:tc>
-      </w:tr>
-      <w:tr>
-        <w:tc>
-          <w:tcPr/>
-          <w:p>
-            <w:pPr>
-              <w:pStyle w:val="Compact"/>
-              <w:jc w:val="left"/>
-            </w:pPr>
-            <w:r>
-              <w:t xml:space="preserve">M/B &gt; 1</w:t>
-            </w:r>
-          </w:p>
-        </w:tc>
-        <w:tc>
-          <w:tcPr/>
-          <w:p>
-            <w:pPr>
-              <w:pStyle w:val="Compact"/>
-              <w:jc w:val="left"/>
-            </w:pPr>
-            <w:r>
-              <w:t xml:space="preserve">Growth expected; M/B &lt; 1 =</w:t>
-            </w:r>
-            <w:r>
-              <w:t xml:space="preserve"> </w:t>
-            </w:r>
-            <w:r>
-              <w:rPr>
-                <w:bCs/>
-                <w:b/>
-              </w:rPr>
-              <w:t xml:space="preserve">value stock</w:t>
-            </w:r>
-          </w:p>
-        </w:tc>
-      </w:tr>
-      <w:tr>
-        <w:tc>
-          <w:tcPr/>
-          <w:p>
-            <w:pPr>
-              <w:pStyle w:val="Compact"/>
-              <w:jc w:val="left"/>
-            </w:pPr>
-            <w:r>
-              <w:t xml:space="preserve">DuPont ROE</w:t>
-            </w:r>
-          </w:p>
-        </w:tc>
-        <w:tc>
-          <w:tcPr/>
-          <w:p>
-            <w:pPr>
-              <w:pStyle w:val="Compact"/>
-              <w:jc w:val="left"/>
-            </w:pPr>
-            <w:r>
-              <w:t xml:space="preserve">Net Margin × Asset Turnover × Leverage</w:t>
-            </w:r>
-          </w:p>
-        </w:tc>
-      </w:tr>
-      <w:tr>
-        <w:tc>
-          <w:tcPr/>
-          <w:p>
-            <w:pPr>
-              <w:pStyle w:val="Compact"/>
-              <w:jc w:val="left"/>
-            </w:pPr>
-            <w:r>
-              <w:t xml:space="preserve">↑ ROE</w:t>
-            </w:r>
-          </w:p>
-        </w:tc>
-        <w:tc>
-          <w:tcPr/>
-          <w:p>
-            <w:pPr>
-              <w:pStyle w:val="Compact"/>
-              <w:jc w:val="left"/>
-            </w:pPr>
-            <w:r>
-              <w:t xml:space="preserve">↑ debt financing and/or ↑ net margin</w:t>
-            </w:r>
-          </w:p>
-        </w:tc>
-      </w:tr>
-      <w:tr>
-        <w:tc>
-          <w:tcPr/>
-          <w:p>
-            <w:pPr>
-              <w:pStyle w:val="Compact"/>
-              <w:jc w:val="left"/>
-            </w:pPr>
-            <w:r>
-              <w:t xml:space="preserve">Trend</w:t>
-            </w:r>
-          </w:p>
-        </w:tc>
-        <w:tc>
-          <w:tcPr/>
-          <w:p>
-            <w:pPr>
-              <w:pStyle w:val="Compact"/>
-              <w:jc w:val="left"/>
-            </w:pPr>
-            <w:r>
-              <w:t xml:space="preserve">Same firm over time</w:t>
-            </w:r>
-          </w:p>
-        </w:tc>
-      </w:tr>
-      <w:tr>
-        <w:tc>
-          <w:tcPr/>
-          <w:p>
-            <w:pPr>
-              <w:pStyle w:val="Compact"/>
-              <w:jc w:val="left"/>
-            </w:pPr>
-            <w:r>
-              <w:t xml:space="preserve">Cross-sectional / benchmark</w:t>
-            </w:r>
-          </w:p>
-        </w:tc>
-        <w:tc>
-          <w:tcPr/>
-          <w:p>
-            <w:pPr>
-              <w:pStyle w:val="Compact"/>
-              <w:jc w:val="left"/>
-            </w:pPr>
-            <w:r>
-              <w:t xml:space="preserve">vs peers / industry</w:t>
-            </w:r>
-          </w:p>
-        </w:tc>
-      </w:tr>
-      <w:tr>
-        <w:tc>
-          <w:tcPr/>
-          <w:p>
-            <w:pPr>
-              <w:pStyle w:val="Compact"/>
-              <w:jc w:val="left"/>
-            </w:pPr>
-            <w:r>
-              <w:t xml:space="preserve">Progress</w:t>
-            </w:r>
-          </w:p>
-        </w:tc>
-        <w:tc>
-          <w:tcPr/>
-          <w:p>
-            <w:pPr>
-              <w:pStyle w:val="Compact"/>
-              <w:jc w:val="left"/>
-            </w:pPr>
-            <w:r>
-              <w:t xml:space="preserve">vs a</w:t>
-            </w:r>
-            <w:r>
-              <w:t xml:space="preserve"> </w:t>
-            </w:r>
-            <w:r>
-              <w:rPr>
-                <w:bCs/>
-                <w:b/>
-              </w:rPr>
-              <w:t xml:space="preserve">goal</w:t>
-            </w:r>
-          </w:p>
-        </w:tc>
-      </w:tr>
-    </w:tbl>
-    <w:bookmarkEnd w:id="24"/>
-    <w:bookmarkStart w:id="25" w:name="cash-flows-to-include-exclude-unit-6"/>
-    <w:p>
-      <w:pPr>
-        <w:pStyle w:val="Heading3"/>
-      </w:pPr>
-      <w:r>
-        <w:t xml:space="preserve">Cash flows to include / exclude (Unit 6)</w:t>
       </w:r>
     </w:p>
     <w:tbl>
@@ -1689,6 +1705,553 @@
               <w:jc w:val="left"/>
             </w:pPr>
             <w:r>
+              <w:t xml:space="preserve">Idea</w:t>
+            </w:r>
+          </w:p>
+        </w:tc>
+        <w:tc>
+          <w:tcPr/>
+          <w:p>
+            <w:pPr>
+              <w:pStyle w:val="Compact"/>
+              <w:jc w:val="left"/>
+            </w:pPr>
+            <w:r>
+              <w:t xml:space="preserve">Rule</w:t>
+            </w:r>
+          </w:p>
+        </w:tc>
+      </w:tr>
+      <w:tr>
+        <w:tc>
+          <w:tcPr/>
+          <w:p>
+            <w:pPr>
+              <w:pStyle w:val="Compact"/>
+              <w:jc w:val="left"/>
+            </w:pPr>
+            <w:r>
+              <w:t xml:space="preserve">Suppliers / ST creditors / banks care about</w:t>
+            </w:r>
+          </w:p>
+        </w:tc>
+        <w:tc>
+          <w:tcPr/>
+          <w:p>
+            <w:pPr>
+              <w:pStyle w:val="Compact"/>
+              <w:jc w:val="left"/>
+            </w:pPr>
+            <w:r>
+              <w:rPr>
+                <w:bCs/>
+                <w:b/>
+              </w:rPr>
+              <w:t xml:space="preserve">Liquidity</w:t>
+            </w:r>
+          </w:p>
+        </w:tc>
+      </w:tr>
+      <w:tr>
+        <w:tc>
+          <w:tcPr/>
+          <w:p>
+            <w:pPr>
+              <w:pStyle w:val="Compact"/>
+              <w:jc w:val="left"/>
+            </w:pPr>
+            <w:r>
+              <w:t xml:space="preserve">Quick (acid-test) vs current</w:t>
+            </w:r>
+          </w:p>
+        </w:tc>
+        <w:tc>
+          <w:tcPr/>
+          <w:p>
+            <w:pPr>
+              <w:pStyle w:val="Compact"/>
+              <w:jc w:val="left"/>
+            </w:pPr>
+            <w:r>
+              <w:t xml:space="preserve">Quick</w:t>
+            </w:r>
+            <w:r>
+              <w:t xml:space="preserve"> </w:t>
+            </w:r>
+            <w:r>
+              <w:rPr>
+                <w:bCs/>
+                <w:b/>
+              </w:rPr>
+              <w:t xml:space="preserve">excludes inventory</w:t>
+            </w:r>
+            <w:r>
+              <w:t xml:space="preserve">; always ≤ current; want quick</w:t>
+            </w:r>
+            <w:r>
+              <w:t xml:space="preserve"> </w:t>
+            </w:r>
+            <w:r>
+              <w:rPr>
+                <w:bCs/>
+                <w:b/>
+              </w:rPr>
+              <w:t xml:space="preserve">&gt; 1</w:t>
+            </w:r>
+          </w:p>
+        </w:tc>
+      </w:tr>
+      <w:tr>
+        <w:tc>
+          <w:tcPr/>
+          <w:p>
+            <w:pPr>
+              <w:pStyle w:val="Compact"/>
+              <w:jc w:val="left"/>
+            </w:pPr>
+            <w:r>
+              <w:t xml:space="preserve">High inventory turnover vs peers</w:t>
+            </w:r>
+          </w:p>
+        </w:tc>
+        <w:tc>
+          <w:tcPr/>
+          <w:p>
+            <w:pPr>
+              <w:pStyle w:val="Compact"/>
+              <w:jc w:val="left"/>
+            </w:pPr>
+            <w:r>
+              <w:t xml:space="preserve">May mean</w:t>
+            </w:r>
+            <w:r>
+              <w:t xml:space="preserve"> </w:t>
+            </w:r>
+            <w:r>
+              <w:rPr>
+                <w:bCs/>
+                <w:b/>
+              </w:rPr>
+              <w:t xml:space="preserve">not enough inventory</w:t>
+            </w:r>
+            <w:r>
+              <w:t xml:space="preserve"> </w:t>
+            </w:r>
+            <w:r>
+              <w:t xml:space="preserve">/ stockouts</w:t>
+            </w:r>
+          </w:p>
+        </w:tc>
+      </w:tr>
+      <w:tr>
+        <w:tc>
+          <w:tcPr/>
+          <w:p>
+            <w:pPr>
+              <w:pStyle w:val="Compact"/>
+              <w:jc w:val="left"/>
+            </w:pPr>
+            <w:r>
+              <w:t xml:space="preserve">ACP too high vs industry</w:t>
+            </w:r>
+          </w:p>
+        </w:tc>
+        <w:tc>
+          <w:tcPr/>
+          <w:p>
+            <w:pPr>
+              <w:pStyle w:val="Compact"/>
+              <w:jc w:val="left"/>
+            </w:pPr>
+            <w:r>
+              <w:rPr>
+                <w:bCs/>
+                <w:b/>
+              </w:rPr>
+              <w:t xml:space="preserve">Tighten credit standards</w:t>
+            </w:r>
+          </w:p>
+        </w:tc>
+      </w:tr>
+      <w:tr>
+        <w:tc>
+          <w:tcPr/>
+          <w:p>
+            <w:pPr>
+              <w:pStyle w:val="Compact"/>
+              <w:jc w:val="left"/>
+            </w:pPr>
+            <w:r>
+              <w:t xml:space="preserve">Debt ratio 40%</w:t>
+            </w:r>
+          </w:p>
+        </w:tc>
+        <w:tc>
+          <w:tcPr/>
+          <w:p>
+            <w:pPr>
+              <w:pStyle w:val="Compact"/>
+              <w:jc w:val="left"/>
+            </w:pPr>
+            <w:r>
+              <w:t xml:space="preserve">40% of</w:t>
+            </w:r>
+            <w:r>
+              <w:t xml:space="preserve"> </w:t>
+            </w:r>
+            <w:r>
+              <w:rPr>
+                <w:bCs/>
+                <w:b/>
+              </w:rPr>
+              <w:t xml:space="preserve">assets</w:t>
+            </w:r>
+            <w:r>
+              <w:t xml:space="preserve"> </w:t>
+            </w:r>
+            <w:r>
+              <w:t xml:space="preserve">financed by debt</w:t>
+            </w:r>
+          </w:p>
+        </w:tc>
+      </w:tr>
+      <w:tr>
+        <w:tc>
+          <w:tcPr/>
+          <w:p>
+            <w:pPr>
+              <w:pStyle w:val="Compact"/>
+              <w:jc w:val="left"/>
+            </w:pPr>
+            <w:r>
+              <w:t xml:space="preserve">Operating margin</w:t>
+            </w:r>
+          </w:p>
+        </w:tc>
+        <w:tc>
+          <w:tcPr/>
+          <w:p>
+            <w:pPr>
+              <w:pStyle w:val="Compact"/>
+              <w:jc w:val="left"/>
+            </w:pPr>
+            <w:r>
+              <w:t xml:space="preserve">Compare firms with different capital structures</w:t>
+            </w:r>
+          </w:p>
+        </w:tc>
+      </w:tr>
+      <w:tr>
+        <w:tc>
+          <w:tcPr/>
+          <w:p>
+            <w:pPr>
+              <w:pStyle w:val="Compact"/>
+              <w:jc w:val="left"/>
+            </w:pPr>
+            <w:r>
+              <w:t xml:space="preserve">Net margin 7%</w:t>
+            </w:r>
+          </w:p>
+        </w:tc>
+        <w:tc>
+          <w:tcPr/>
+          <w:p>
+            <w:pPr>
+              <w:pStyle w:val="Compact"/>
+              <w:jc w:val="left"/>
+            </w:pPr>
+            <w:r>
+              <w:t xml:space="preserve">7¢ per $1 sales for</w:t>
+            </w:r>
+            <w:r>
+              <w:t xml:space="preserve"> </w:t>
+            </w:r>
+            <w:r>
+              <w:rPr>
+                <w:bCs/>
+                <w:b/>
+              </w:rPr>
+              <w:t xml:space="preserve">equity holders</w:t>
+            </w:r>
+          </w:p>
+        </w:tc>
+      </w:tr>
+      <w:tr>
+        <w:tc>
+          <w:tcPr/>
+          <w:p>
+            <w:pPr>
+              <w:pStyle w:val="Compact"/>
+              <w:jc w:val="left"/>
+            </w:pPr>
+            <w:r>
+              <w:t xml:space="preserve">M/B &gt; 1</w:t>
+            </w:r>
+          </w:p>
+        </w:tc>
+        <w:tc>
+          <w:tcPr/>
+          <w:p>
+            <w:pPr>
+              <w:pStyle w:val="Compact"/>
+              <w:jc w:val="left"/>
+            </w:pPr>
+            <w:r>
+              <w:t xml:space="preserve">Growth stock; M/B &lt; 1 =</w:t>
+            </w:r>
+            <w:r>
+              <w:t xml:space="preserve"> </w:t>
+            </w:r>
+            <w:r>
+              <w:rPr>
+                <w:bCs/>
+                <w:b/>
+              </w:rPr>
+              <w:t xml:space="preserve">value stock</w:t>
+            </w:r>
+          </w:p>
+        </w:tc>
+      </w:tr>
+      <w:tr>
+        <w:tc>
+          <w:tcPr/>
+          <w:p>
+            <w:pPr>
+              <w:pStyle w:val="Compact"/>
+              <w:jc w:val="left"/>
+            </w:pPr>
+            <w:r>
+              <w:t xml:space="preserve">P/E low</w:t>
+            </w:r>
+          </w:p>
+        </w:tc>
+        <w:tc>
+          <w:tcPr/>
+          <w:p>
+            <w:pPr>
+              <w:pStyle w:val="Compact"/>
+              <w:jc w:val="left"/>
+            </w:pPr>
+            <w:r>
+              <w:t xml:space="preserve">Undervalued / cheaper; P/E high = overpriced</w:t>
+            </w:r>
+          </w:p>
+        </w:tc>
+      </w:tr>
+      <w:tr>
+        <w:tc>
+          <w:tcPr/>
+          <w:p>
+            <w:pPr>
+              <w:pStyle w:val="Compact"/>
+              <w:jc w:val="left"/>
+            </w:pPr>
+            <w:r>
+              <w:t xml:space="preserve">DuPont ROE</w:t>
+            </w:r>
+          </w:p>
+        </w:tc>
+        <w:tc>
+          <w:tcPr/>
+          <w:p>
+            <w:pPr>
+              <w:pStyle w:val="Compact"/>
+              <w:jc w:val="left"/>
+            </w:pPr>
+            <w:r>
+              <w:t xml:space="preserve">Net Margin × Asset Turnover × Leverage</w:t>
+            </w:r>
+          </w:p>
+        </w:tc>
+      </w:tr>
+      <w:tr>
+        <w:tc>
+          <w:tcPr/>
+          <w:p>
+            <w:pPr>
+              <w:pStyle w:val="Compact"/>
+              <w:jc w:val="left"/>
+            </w:pPr>
+            <w:r>
+              <w:t xml:space="preserve">ROA</w:t>
+            </w:r>
+          </w:p>
+        </w:tc>
+        <w:tc>
+          <w:tcPr/>
+          <w:p>
+            <w:pPr>
+              <w:pStyle w:val="Compact"/>
+              <w:jc w:val="left"/>
+            </w:pPr>
+            <w:r>
+              <w:t xml:space="preserve">Profitability × turnover only (</w:t>
+            </w:r>
+            <w:r>
+              <w:rPr>
+                <w:bCs/>
+                <w:b/>
+              </w:rPr>
+              <w:t xml:space="preserve">no</w:t>
+            </w:r>
+            <w:r>
+              <w:t xml:space="preserve"> </w:t>
+            </w:r>
+            <w:r>
+              <w:t xml:space="preserve">leverage)</w:t>
+            </w:r>
+          </w:p>
+        </w:tc>
+      </w:tr>
+      <w:tr>
+        <w:tc>
+          <w:tcPr/>
+          <w:p>
+            <w:pPr>
+              <w:pStyle w:val="Compact"/>
+              <w:jc w:val="left"/>
+            </w:pPr>
+            <w:r>
+              <w:t xml:space="preserve">↑ ROE</w:t>
+            </w:r>
+          </w:p>
+        </w:tc>
+        <w:tc>
+          <w:tcPr/>
+          <w:p>
+            <w:pPr>
+              <w:pStyle w:val="Compact"/>
+              <w:jc w:val="left"/>
+            </w:pPr>
+            <w:r>
+              <w:t xml:space="preserve">↑ debt financing and/or ↑ net margin</w:t>
+            </w:r>
+          </w:p>
+        </w:tc>
+      </w:tr>
+      <w:tr>
+        <w:tc>
+          <w:tcPr/>
+          <w:p>
+            <w:pPr>
+              <w:pStyle w:val="Compact"/>
+              <w:jc w:val="left"/>
+            </w:pPr>
+            <w:r>
+              <w:t xml:space="preserve">Trend</w:t>
+            </w:r>
+          </w:p>
+        </w:tc>
+        <w:tc>
+          <w:tcPr/>
+          <w:p>
+            <w:pPr>
+              <w:pStyle w:val="Compact"/>
+              <w:jc w:val="left"/>
+            </w:pPr>
+            <w:r>
+              <w:t xml:space="preserve">Same firm over time</w:t>
+            </w:r>
+          </w:p>
+        </w:tc>
+      </w:tr>
+      <w:tr>
+        <w:tc>
+          <w:tcPr/>
+          <w:p>
+            <w:pPr>
+              <w:pStyle w:val="Compact"/>
+              <w:jc w:val="left"/>
+            </w:pPr>
+            <w:r>
+              <w:t xml:space="preserve">Cross-sectional / benchmark</w:t>
+            </w:r>
+          </w:p>
+        </w:tc>
+        <w:tc>
+          <w:tcPr/>
+          <w:p>
+            <w:pPr>
+              <w:pStyle w:val="Compact"/>
+              <w:jc w:val="left"/>
+            </w:pPr>
+            <w:r>
+              <w:t xml:space="preserve">vs peers / industry (benchmark = top performers)</w:t>
+            </w:r>
+          </w:p>
+        </w:tc>
+      </w:tr>
+      <w:tr>
+        <w:tc>
+          <w:tcPr/>
+          <w:p>
+            <w:pPr>
+              <w:pStyle w:val="Compact"/>
+              <w:jc w:val="left"/>
+            </w:pPr>
+            <w:r>
+              <w:t xml:space="preserve">Progress</w:t>
+            </w:r>
+          </w:p>
+        </w:tc>
+        <w:tc>
+          <w:tcPr/>
+          <w:p>
+            <w:pPr>
+              <w:pStyle w:val="Compact"/>
+              <w:jc w:val="left"/>
+            </w:pPr>
+            <w:r>
+              <w:t xml:space="preserve">vs a</w:t>
+            </w:r>
+            <w:r>
+              <w:t xml:space="preserve"> </w:t>
+            </w:r>
+            <w:r>
+              <w:rPr>
+                <w:bCs/>
+                <w:b/>
+              </w:rPr>
+              <w:t xml:space="preserve">goal</w:t>
+            </w:r>
+          </w:p>
+        </w:tc>
+      </w:tr>
+    </w:tbl>
+    <w:bookmarkEnd w:id="24"/>
+    <w:bookmarkStart w:id="25" w:name="cash-flows-to-include-exclude-unit-6"/>
+    <w:p>
+      <w:pPr>
+        <w:pStyle w:val="Heading3"/>
+      </w:pPr>
+      <w:r>
+        <w:t xml:space="preserve">Cash flows to include / exclude (Unit 6)</w:t>
+      </w:r>
+    </w:p>
+    <w:tbl>
+      <w:tblPr>
+        <w:tblStyle w:val="Table"/>
+        <w:tblW w:type="pct" w:w="5000"/>
+        <w:tblLook w:firstRow="1" w:lastRow="0" w:firstColumn="0" w:lastColumn="0" w:noHBand="0" w:noVBand="0" w:val="0020"/>
+        <w:jc w:val="start"/>
+      </w:tblPr>
+      <w:tblGrid>
+        <w:gridCol w:w="3960"/>
+        <w:gridCol w:w="3960"/>
+      </w:tblGrid>
+      <w:tr>
+        <w:trPr>
+          <w:tblHeader w:val="true"/>
+        </w:trPr>
+        <w:tc>
+          <w:tcPr/>
+          <w:p>
+            <w:pPr>
+              <w:pStyle w:val="Compact"/>
+              <w:jc w:val="left"/>
+            </w:pPr>
+            <w:r>
               <w:t xml:space="preserve">Include</w:t>
             </w:r>
           </w:p>
@@ -2126,6 +2689,177 @@
         </w:tc>
       </w:tr>
     </w:tbl>
+    <w:bookmarkEnd w:id="26"/>
+    <w:bookmarkStart w:id="27" w:name="risk-quick-hits-unit-3-module-6"/>
+    <w:p>
+      <w:pPr>
+        <w:pStyle w:val="Heading3"/>
+      </w:pPr>
+      <w:r>
+        <w:t xml:space="preserve">Risk quick hits (Unit 3 Module 6)</w:t>
+      </w:r>
+    </w:p>
+    <w:tbl>
+      <w:tblPr>
+        <w:tblStyle w:val="Table"/>
+        <w:tblW w:type="pct" w:w="5000"/>
+        <w:tblLook w:firstRow="1" w:lastRow="0" w:firstColumn="0" w:lastColumn="0" w:noHBand="0" w:noVBand="0" w:val="0020"/>
+        <w:jc w:val="start"/>
+      </w:tblPr>
+      <w:tblGrid>
+        <w:gridCol w:w="2970"/>
+        <w:gridCol w:w="4950"/>
+      </w:tblGrid>
+      <w:tr>
+        <w:trPr>
+          <w:tblHeader w:val="true"/>
+        </w:trPr>
+        <w:tc>
+          <w:tcPr/>
+          <w:p>
+            <w:pPr>
+              <w:pStyle w:val="Compact"/>
+              <w:jc w:val="left"/>
+            </w:pPr>
+            <w:r>
+              <w:t xml:space="preserve">Item</w:t>
+            </w:r>
+          </w:p>
+        </w:tc>
+        <w:tc>
+          <w:tcPr/>
+          <w:p>
+            <w:pPr>
+              <w:pStyle w:val="Compact"/>
+              <w:jc w:val="left"/>
+            </w:pPr>
+            <w:r>
+              <w:t xml:space="preserve">Remember</w:t>
+            </w:r>
+          </w:p>
+        </w:tc>
+      </w:tr>
+      <w:tr>
+        <w:tc>
+          <w:tcPr/>
+          <w:p>
+            <w:pPr>
+              <w:pStyle w:val="Compact"/>
+              <w:jc w:val="left"/>
+            </w:pPr>
+            <w:r>
+              <w:t xml:space="preserve">Systematic / market</w:t>
+            </w:r>
+          </w:p>
+        </w:tc>
+        <w:tc>
+          <w:tcPr/>
+          <w:p>
+            <w:pPr>
+              <w:pStyle w:val="Compact"/>
+              <w:jc w:val="left"/>
+            </w:pPr>
+            <w:r>
+              <w:t xml:space="preserve">Cannot diversify; measured by</w:t>
+            </w:r>
+            <w:r>
+              <w:t xml:space="preserve"> </w:t>
+            </w:r>
+            <w:r>
+              <w:rPr>
+                <w:bCs/>
+                <w:b/>
+              </w:rPr>
+              <w:t xml:space="preserve">beta</w:t>
+            </w:r>
+            <w:r>
+              <w:t xml:space="preserve"> </w:t>
+            </w:r>
+            <w:r>
+              <w:t xml:space="preserve">(market β = 1)</w:t>
+            </w:r>
+          </w:p>
+        </w:tc>
+      </w:tr>
+      <w:tr>
+        <w:tc>
+          <w:tcPr/>
+          <w:p>
+            <w:pPr>
+              <w:pStyle w:val="Compact"/>
+              <w:jc w:val="left"/>
+            </w:pPr>
+            <w:r>
+              <w:t xml:space="preserve">Unsystematic / firm-specific / idiosyncratic</w:t>
+            </w:r>
+          </w:p>
+        </w:tc>
+        <w:tc>
+          <w:tcPr/>
+          <w:p>
+            <w:pPr>
+              <w:pStyle w:val="Compact"/>
+              <w:jc w:val="left"/>
+            </w:pPr>
+            <w:r>
+              <w:t xml:space="preserve">Can diversify away</w:t>
+            </w:r>
+          </w:p>
+        </w:tc>
+      </w:tr>
+      <w:tr>
+        <w:tc>
+          <w:tcPr/>
+          <w:p>
+            <w:pPr>
+              <w:pStyle w:val="Compact"/>
+              <w:jc w:val="left"/>
+            </w:pPr>
+            <w:r>
+              <w:t xml:space="preserve">Risk strategies</w:t>
+            </w:r>
+          </w:p>
+        </w:tc>
+        <w:tc>
+          <w:tcPr/>
+          <w:p>
+            <w:pPr>
+              <w:pStyle w:val="Compact"/>
+              <w:jc w:val="left"/>
+            </w:pPr>
+            <w:r>
+              <w:t xml:space="preserve">Diversify, separate (geography), transfer (insurance), retain, avoid</w:t>
+            </w:r>
+          </w:p>
+        </w:tc>
+      </w:tr>
+      <w:tr>
+        <w:tc>
+          <w:tcPr/>
+          <w:p>
+            <w:pPr>
+              <w:pStyle w:val="Compact"/>
+              <w:jc w:val="left"/>
+            </w:pPr>
+            <w:r>
+              <w:t xml:space="preserve">Higher risk</w:t>
+            </w:r>
+          </w:p>
+        </w:tc>
+        <w:tc>
+          <w:tcPr/>
+          <w:p>
+            <w:pPr>
+              <w:pStyle w:val="Compact"/>
+              <w:jc w:val="left"/>
+            </w:pPr>
+            <w:r>
+              <w:t xml:space="preserve">Higher required / expected return</w:t>
+            </w:r>
+          </w:p>
+        </w:tc>
+      </w:tr>
+    </w:tbl>
     <w:p>
       <w:r>
         <w:pict>
@@ -2133,9 +2867,9 @@
         </w:pict>
       </w:r>
     </w:p>
-    <w:bookmarkEnd w:id="26"/>
     <w:bookmarkEnd w:id="27"/>
-    <w:bookmarkStart w:id="32" w:name="X96bd978ce2073e9b7ee75ee6db9c7bf463d9446"/>
+    <w:bookmarkEnd w:id="28"/>
+    <w:bookmarkStart w:id="33" w:name="X96bd978ce2073e9b7ee75ee6db9c7bf463d9446"/>
     <w:p>
       <w:pPr>
         <w:pStyle w:val="Heading2"/>
@@ -2144,7 +2878,7 @@
         <w:t xml:space="preserve">Instructor Cohort Highlights (Your Transcripts)</w:t>
       </w:r>
     </w:p>
-    <w:bookmarkStart w:id="28" w:name="Xddc1d1182018ff036928731978342d3a4611a12"/>
+    <w:bookmarkStart w:id="29" w:name="Xddc1d1182018ff036928731978342d3a4611a12"/>
     <w:p>
       <w:pPr>
         <w:pStyle w:val="Heading3"/>
@@ -2178,7 +2912,7 @@
         <w:pStyle w:val="Compact"/>
       </w:pPr>
       <w:r>
-        <w:t xml:space="preserve">Covers interest/required return/inflation, TVM Excel, and risk &amp; return.</w:t>
+        <w:t xml:space="preserve">Modules: interest/required return/inflation → TVM Excel → risk &amp; return.</w:t>
       </w:r>
     </w:p>
     <w:p>
@@ -2190,23 +2924,7 @@
         <w:pStyle w:val="Compact"/>
       </w:pPr>
       <w:r>
-        <w:t xml:space="preserve">Excel on PA/OA uses</w:t>
-      </w:r>
-      <w:r>
-        <w:t xml:space="preserve"> </w:t>
-      </w:r>
-      <w:r>
-        <w:rPr>
-          <w:bCs/>
-          <w:b/>
-        </w:rPr>
-        <w:t xml:space="preserve">compound interest</w:t>
-      </w:r>
-      <w:r>
-        <w:t xml:space="preserve"> </w:t>
-      </w:r>
-      <w:r>
-        <w:t xml:space="preserve">concepts.</w:t>
+        <w:t xml:space="preserve">Simple interest = P×R×T (straight line); compound = interest on interest (Excel on PA/OA).</w:t>
       </w:r>
     </w:p>
     <w:p>
@@ -2218,7 +2936,7 @@
         <w:pStyle w:val="Compact"/>
       </w:pPr>
       <w:r>
-        <w:t xml:space="preserve">Simple interest = straight line (P×R×T); compound = exponential (interest on interest).</w:t>
+        <w:t xml:space="preserve">Required return = opportunity cost + inflation + risk (hurdle rate).</w:t>
       </w:r>
     </w:p>
     <w:p>
@@ -2230,11 +2948,83 @@
         <w:pStyle w:val="Compact"/>
       </w:pPr>
       <w:r>
-        <w:t xml:space="preserve">Practice every Excel problem type before the PA/OA.</w:t>
-      </w:r>
-    </w:p>
-    <w:bookmarkEnd w:id="28"/>
-    <w:bookmarkStart w:id="29" w:name="X8573cfbab8a1073cdc08c4d60a4c9c52dd4a68e"/>
+        <w:t xml:space="preserve">Inflation causes: demand-pull, cost-push, adaptive expectations (wages chase prices).</w:t>
+      </w:r>
+    </w:p>
+    <w:p>
+      <w:pPr>
+        <w:numPr>
+          <w:ilvl w:val="0"/>
+          <w:numId w:val="1001"/>
+        </w:numPr>
+        <w:pStyle w:val="Compact"/>
+      </w:pPr>
+      <w:r>
+        <w:t xml:space="preserve">Real ≈ nominal − inflation; invest if real return &gt; required return.</w:t>
+      </w:r>
+    </w:p>
+    <w:p>
+      <w:pPr>
+        <w:numPr>
+          <w:ilvl w:val="0"/>
+          <w:numId w:val="1001"/>
+        </w:numPr>
+        <w:pStyle w:val="Compact"/>
+      </w:pPr>
+      <w:r>
+        <w:t xml:space="preserve">Excel: never blank cells (use 0); cell references only; TYPE 0 = ordinary/end; TYPE 1 = begin/today; TYPE only affects Pmt.</w:t>
+      </w:r>
+    </w:p>
+    <w:p>
+      <w:pPr>
+        <w:numPr>
+          <w:ilvl w:val="0"/>
+          <w:numId w:val="1001"/>
+        </w:numPr>
+        <w:pStyle w:val="Compact"/>
+      </w:pPr>
+      <w:r>
+        <w:t xml:space="preserve">Signs: money leaving account = negative; money received = positive.</w:t>
+      </w:r>
+    </w:p>
+    <w:p>
+      <w:pPr>
+        <w:numPr>
+          <w:ilvl w:val="0"/>
+          <w:numId w:val="1001"/>
+        </w:numPr>
+        <w:pStyle w:val="Compact"/>
+      </w:pPr>
+      <w:r>
+        <w:t xml:space="preserve">Uneven flows → NPV (value) or IRR (rate); even repeating Pmt → PV/FV.</w:t>
+      </w:r>
+    </w:p>
+    <w:p>
+      <w:pPr>
+        <w:numPr>
+          <w:ilvl w:val="0"/>
+          <w:numId w:val="1001"/>
+        </w:numPr>
+        <w:pStyle w:val="Compact"/>
+      </w:pPr>
+      <w:r>
+        <w:t xml:space="preserve">Risk width = standard deviation; beta = market sensitivity; T-bills ≈ beta 0.</w:t>
+      </w:r>
+    </w:p>
+    <w:p>
+      <w:pPr>
+        <w:numPr>
+          <w:ilvl w:val="0"/>
+          <w:numId w:val="1001"/>
+        </w:numPr>
+        <w:pStyle w:val="Compact"/>
+      </w:pPr>
+      <w:r>
+        <w:t xml:space="preserve">Practice every Excel problem type before PA/OA.</w:t>
+      </w:r>
+    </w:p>
+    <w:bookmarkEnd w:id="29"/>
+    <w:bookmarkStart w:id="30" w:name="X8573cfbab8a1073cdc08c4d60a4c9c52dd4a68e"/>
     <w:p>
       <w:pPr>
         <w:pStyle w:val="Heading3"/>
@@ -2252,6 +3042,18 @@
         <w:pStyle w:val="Compact"/>
       </w:pPr>
       <w:r>
+        <w:t xml:space="preserve">Benefits of ratios: standardization, flexibility, focus, evaluation.</w:t>
+      </w:r>
+    </w:p>
+    <w:p>
+      <w:pPr>
+        <w:numPr>
+          <w:ilvl w:val="0"/>
+          <w:numId w:val="1002"/>
+        </w:numPr>
+        <w:pStyle w:val="Compact"/>
+      </w:pPr>
+      <w:r>
         <w:rPr>
           <w:bCs/>
           <w:b/>
@@ -2307,7 +3109,23 @@
         <w:t xml:space="preserve"> </w:t>
       </w:r>
       <w:r>
-        <w:t xml:space="preserve">= vs peers; benchmarking is a form of cross-sectional.</w:t>
+        <w:t xml:space="preserve">= vs peers;</w:t>
+      </w:r>
+      <w:r>
+        <w:t xml:space="preserve"> </w:t>
+      </w:r>
+      <w:r>
+        <w:rPr>
+          <w:bCs/>
+          <w:b/>
+        </w:rPr>
+        <w:t xml:space="preserve">benchmarking</w:t>
+      </w:r>
+      <w:r>
+        <w:t xml:space="preserve"> </w:t>
+      </w:r>
+      <w:r>
+        <w:t xml:space="preserve">= vs top performers.</w:t>
       </w:r>
     </w:p>
     <w:p>
@@ -2370,7 +3188,7 @@
         <w:t xml:space="preserve"> </w:t>
       </w:r>
       <w:r>
-        <w:t xml:space="preserve">(acid test) excludes inventory — always ≤ current ratio.</w:t>
+        <w:t xml:space="preserve">(acid test) excludes inventory — always ≤ current ratio; want &gt; 1.</w:t>
       </w:r>
     </w:p>
     <w:p>
@@ -2382,6 +3200,74 @@
         <w:pStyle w:val="Compact"/>
       </w:pPr>
       <w:r>
+        <w:t xml:space="preserve">Activity ≈</w:t>
+      </w:r>
+      <w:r>
+        <w:t xml:space="preserve"> </w:t>
+      </w:r>
+      <w:r>
+        <w:rPr>
+          <w:bCs/>
+          <w:b/>
+        </w:rPr>
+        <w:t xml:space="preserve">turnover</w:t>
+      </w:r>
+      <w:r>
+        <w:t xml:space="preserve"> </w:t>
+      </w:r>
+      <w:r>
+        <w:t xml:space="preserve">(sales); profitability ≈</w:t>
+      </w:r>
+      <w:r>
+        <w:t xml:space="preserve"> </w:t>
+      </w:r>
+      <w:r>
+        <w:rPr>
+          <w:bCs/>
+          <w:b/>
+        </w:rPr>
+        <w:t xml:space="preserve">margins/returns</w:t>
+      </w:r>
+      <w:r>
+        <w:t xml:space="preserve"> </w:t>
+      </w:r>
+      <w:r>
+        <w:t xml:space="preserve">(after costs).</w:t>
+      </w:r>
+    </w:p>
+    <w:p>
+      <w:pPr>
+        <w:numPr>
+          <w:ilvl w:val="0"/>
+          <w:numId w:val="1002"/>
+        </w:numPr>
+        <w:pStyle w:val="Compact"/>
+      </w:pPr>
+      <w:r>
+        <w:t xml:space="preserve">Leverage = long-term financing/solvency (vs liquidity = short-term).</w:t>
+      </w:r>
+    </w:p>
+    <w:p>
+      <w:pPr>
+        <w:numPr>
+          <w:ilvl w:val="0"/>
+          <w:numId w:val="1002"/>
+        </w:numPr>
+        <w:pStyle w:val="Compact"/>
+      </w:pPr>
+      <w:r>
+        <w:t xml:space="preserve">M/B &gt; 1 growth; M/B &lt; 1 value; P/E low = undervalued.</w:t>
+      </w:r>
+    </w:p>
+    <w:p>
+      <w:pPr>
+        <w:numPr>
+          <w:ilvl w:val="0"/>
+          <w:numId w:val="1002"/>
+        </w:numPr>
+        <w:pStyle w:val="Compact"/>
+      </w:pPr>
+      <w:r>
         <w:rPr>
           <w:bCs/>
           <w:b/>
@@ -2389,14 +3275,39 @@
         <w:t xml:space="preserve">DuPont</w:t>
       </w:r>
       <w:r>
-        <w:t xml:space="preserve"> </w:t>
-      </w:r>
-      <w:r>
-        <w:t xml:space="preserve">focuses you on what drives ROE: profitability, asset efficiency, leverage.</w:t>
-      </w:r>
-    </w:p>
-    <w:bookmarkEnd w:id="29"/>
-    <w:bookmarkStart w:id="30" w:name="Xc292d6bd2f11d38b710bfe91d8d94233ca17d13"/>
+        <w:t xml:space="preserve">: ROE = margin × turnover × leverage; ROA excludes leverage lever.</w:t>
+      </w:r>
+    </w:p>
+    <w:p>
+      <w:pPr>
+        <w:numPr>
+          <w:ilvl w:val="0"/>
+          <w:numId w:val="1002"/>
+        </w:numPr>
+        <w:pStyle w:val="Compact"/>
+      </w:pPr>
+      <w:r>
+        <w:t xml:space="preserve">OA is light on calculation, heavy on</w:t>
+      </w:r>
+      <w:r>
+        <w:t xml:space="preserve"> </w:t>
+      </w:r>
+      <w:r>
+        <w:rPr>
+          <w:bCs/>
+          <w:b/>
+        </w:rPr>
+        <w:t xml:space="preserve">relationships and decisions</w:t>
+      </w:r>
+      <w:r>
+        <w:t xml:space="preserve"> </w:t>
+      </w:r>
+      <w:r>
+        <w:t xml:space="preserve">(what raises a ratio?).</w:t>
+      </w:r>
+    </w:p>
+    <w:bookmarkEnd w:id="30"/>
+    <w:bookmarkStart w:id="31" w:name="Xc292d6bd2f11d38b710bfe91d8d94233ca17d13"/>
     <w:p>
       <w:pPr>
         <w:pStyle w:val="Heading3"/>
@@ -2414,6 +3325,33 @@
         <w:pStyle w:val="Compact"/>
       </w:pPr>
       <w:r>
+        <w:t xml:space="preserve">Forecasting answers</w:t>
+      </w:r>
+      <w:r>
+        <w:t xml:space="preserve"> </w:t>
+      </w:r>
+      <w:r>
+        <w:t xml:space="preserve">“</w:t>
+      </w:r>
+      <w:r>
+        <w:t xml:space="preserve">how much money will we need?</w:t>
+      </w:r>
+      <w:r>
+        <w:t xml:space="preserve">”</w:t>
+      </w:r>
+      <w:r>
+        <w:t xml:space="preserve">; budgeting is targets + variances.</w:t>
+      </w:r>
+    </w:p>
+    <w:p>
+      <w:pPr>
+        <w:numPr>
+          <w:ilvl w:val="0"/>
+          <w:numId w:val="1003"/>
+        </w:numPr>
+        <w:pStyle w:val="Compact"/>
+      </w:pPr>
+      <w:r>
         <w:t xml:space="preserve">Spontaneous accounts</w:t>
       </w:r>
       <w:r>
@@ -2427,6 +3365,294 @@
         <w:t xml:space="preserve">react to sales</w:t>
       </w:r>
       <w:r>
+        <w:t xml:space="preserve">; notes payable / LT debt / new stock do</w:t>
+      </w:r>
+      <w:r>
+        <w:t xml:space="preserve"> </w:t>
+      </w:r>
+      <w:r>
+        <w:rPr>
+          <w:bCs/>
+          <w:b/>
+        </w:rPr>
+        <w:t xml:space="preserve">not</w:t>
+      </w:r>
+      <w:r>
+        <w:t xml:space="preserve"> </w:t>
+      </w:r>
+      <w:r>
+        <w:t xml:space="preserve">auto-scale.</w:t>
+      </w:r>
+    </w:p>
+    <w:p>
+      <w:pPr>
+        <w:numPr>
+          <w:ilvl w:val="0"/>
+          <w:numId w:val="1003"/>
+        </w:numPr>
+        <w:pStyle w:val="Compact"/>
+      </w:pPr>
+      <w:r>
+        <w:t xml:space="preserve">DFN = projected assets − projected liabilities − projected equity (also called AFN/EFN).</w:t>
+      </w:r>
+    </w:p>
+    <w:p>
+      <w:pPr>
+        <w:numPr>
+          <w:ilvl w:val="0"/>
+          <w:numId w:val="1003"/>
+        </w:numPr>
+        <w:pStyle w:val="Compact"/>
+      </w:pPr>
+      <w:r>
+        <w:t xml:space="preserve">DFN &gt; 0 = raise external funds; ≤ 0 = no external need / surplus.</w:t>
+      </w:r>
+    </w:p>
+    <w:p>
+      <w:pPr>
+        <w:numPr>
+          <w:ilvl w:val="0"/>
+          <w:numId w:val="1003"/>
+        </w:numPr>
+        <w:pStyle w:val="Compact"/>
+      </w:pPr>
+      <w:r>
+        <w:t xml:space="preserve">Higher growth usually → higher DFN; ↓ DFN via retention, margins, capacity, slower growth, outsourcing.</w:t>
+      </w:r>
+    </w:p>
+    <w:p>
+      <w:pPr>
+        <w:numPr>
+          <w:ilvl w:val="0"/>
+          <w:numId w:val="1003"/>
+        </w:numPr>
+        <w:pStyle w:val="Compact"/>
+      </w:pPr>
+      <w:r>
+        <w:rPr>
+          <w:bCs/>
+          <w:b/>
+        </w:rPr>
+        <w:t xml:space="preserve">Lumpy assets</w:t>
+      </w:r>
+      <w:r>
+        <w:t xml:space="preserve"> </w:t>
+      </w:r>
+      <w:r>
+        <w:t xml:space="preserve">= large indivisible purchases; check</w:t>
+      </w:r>
+      <w:r>
+        <w:t xml:space="preserve"> </w:t>
+      </w:r>
+      <w:r>
+        <w:rPr>
+          <w:bCs/>
+          <w:b/>
+        </w:rPr>
+        <w:t xml:space="preserve">sales capacity</w:t>
+      </w:r>
+      <w:r>
+        <w:t xml:space="preserve"> </w:t>
+      </w:r>
+      <w:r>
+        <w:t xml:space="preserve">before adding PP&amp;E.</w:t>
+      </w:r>
+    </w:p>
+    <w:p>
+      <w:pPr>
+        <w:numPr>
+          <w:ilvl w:val="0"/>
+          <w:numId w:val="1003"/>
+        </w:numPr>
+        <w:pStyle w:val="Compact"/>
+      </w:pPr>
+      <w:r>
+        <w:t xml:space="preserve">RE = NI − dividends (not % of sales).</w:t>
+      </w:r>
+    </w:p>
+    <w:p>
+      <w:pPr>
+        <w:numPr>
+          <w:ilvl w:val="0"/>
+          <w:numId w:val="1003"/>
+        </w:numPr>
+        <w:pStyle w:val="Compact"/>
+      </w:pPr>
+      <w:r>
+        <w:rPr>
+          <w:bCs/>
+          <w:b/>
+        </w:rPr>
+        <w:t xml:space="preserve">SGR</w:t>
+      </w:r>
+      <w:r>
+        <w:t xml:space="preserve"> </w:t>
+      </w:r>
+      <w:r>
+        <w:t xml:space="preserve">= no new equity (debt OK, constant D/E);</w:t>
+      </w:r>
+      <w:r>
+        <w:t xml:space="preserve"> </w:t>
+      </w:r>
+      <w:r>
+        <w:rPr>
+          <w:bCs/>
+          <w:b/>
+        </w:rPr>
+        <w:t xml:space="preserve">IGR</w:t>
+      </w:r>
+      <w:r>
+        <w:t xml:space="preserve"> </w:t>
+      </w:r>
+      <w:r>
+        <w:t xml:space="preserve">= no new debt or equity.</w:t>
+      </w:r>
+    </w:p>
+    <w:p>
+      <w:pPr>
+        <w:numPr>
+          <w:ilvl w:val="0"/>
+          <w:numId w:val="1003"/>
+        </w:numPr>
+        <w:pStyle w:val="Compact"/>
+      </w:pPr>
+      <w:r>
+        <w:t xml:space="preserve">↑ retention and ↑ ROE → ↑ SGR; firms dislike issuing new shares (dilution).</w:t>
+      </w:r>
+    </w:p>
+    <w:p>
+      <w:pPr>
+        <w:numPr>
+          <w:ilvl w:val="0"/>
+          <w:numId w:val="1003"/>
+        </w:numPr>
+        <w:pStyle w:val="Compact"/>
+      </w:pPr>
+      <w:r>
+        <w:t xml:space="preserve">Interest on pro formas can be independent of sales; refine % of sales when you have better data.</w:t>
+      </w:r>
+    </w:p>
+    <w:bookmarkEnd w:id="31"/>
+    <w:bookmarkStart w:id="32" w:name="unit-6-cohort-instructor"/>
+    <w:p>
+      <w:pPr>
+        <w:pStyle w:val="Heading3"/>
+      </w:pPr>
+      <w:r>
+        <w:t xml:space="preserve">Unit 6 Cohort (instructor)</w:t>
+      </w:r>
+    </w:p>
+    <w:p>
+      <w:pPr>
+        <w:numPr>
+          <w:ilvl w:val="0"/>
+          <w:numId w:val="1004"/>
+        </w:numPr>
+        <w:pStyle w:val="Compact"/>
+      </w:pPr>
+      <w:r>
+        <w:t xml:space="preserve">OA is about</w:t>
+      </w:r>
+      <w:r>
+        <w:t xml:space="preserve"> </w:t>
+      </w:r>
+      <w:r>
+        <w:rPr>
+          <w:bCs/>
+          <w:b/>
+        </w:rPr>
+        <w:t xml:space="preserve">application</w:t>
+      </w:r>
+      <w:r>
+        <w:t xml:space="preserve">, not just terminology.</w:t>
+      </w:r>
+    </w:p>
+    <w:p>
+      <w:pPr>
+        <w:numPr>
+          <w:ilvl w:val="0"/>
+          <w:numId w:val="1004"/>
+        </w:numPr>
+        <w:pStyle w:val="Compact"/>
+      </w:pPr>
+      <w:r>
+        <w:t xml:space="preserve">Ideal method: all relevant CFs + TVM + cost of capital →</w:t>
+      </w:r>
+      <w:r>
+        <w:t xml:space="preserve"> </w:t>
+      </w:r>
+      <w:r>
+        <w:rPr>
+          <w:bCs/>
+          <w:b/>
+        </w:rPr>
+        <w:t xml:space="preserve">NPV</w:t>
+      </w:r>
+      <w:r>
+        <w:t xml:space="preserve"> </w:t>
+      </w:r>
+      <w:r>
+        <w:t xml:space="preserve">meets all three.</w:t>
+      </w:r>
+    </w:p>
+    <w:p>
+      <w:pPr>
+        <w:numPr>
+          <w:ilvl w:val="0"/>
+          <w:numId w:val="1004"/>
+        </w:numPr>
+        <w:pStyle w:val="Compact"/>
+      </w:pPr>
+      <w:r>
+        <w:rPr>
+          <w:bCs/>
+          <w:b/>
+        </w:rPr>
+        <w:t xml:space="preserve">One project / choose one / similar size</w:t>
+      </w:r>
+      <w:r>
+        <w:t xml:space="preserve"> </w:t>
+      </w:r>
+      <w:r>
+        <w:t xml:space="preserve">→</w:t>
+      </w:r>
+      <w:r>
+        <w:t xml:space="preserve"> </w:t>
+      </w:r>
+      <w:r>
+        <w:rPr>
+          <w:bCs/>
+          <w:b/>
+        </w:rPr>
+        <w:t xml:space="preserve">NPV</w:t>
+      </w:r>
+      <w:r>
+        <w:t xml:space="preserve">; capital constraint + rank →</w:t>
+      </w:r>
+      <w:r>
+        <w:t xml:space="preserve"> </w:t>
+      </w:r>
+      <w:r>
+        <w:rPr>
+          <w:bCs/>
+          <w:b/>
+        </w:rPr>
+        <w:t xml:space="preserve">PI</w:t>
+      </w:r>
+      <w:r>
+        <w:t xml:space="preserve">; intuitive % →</w:t>
+      </w:r>
+      <w:r>
+        <w:t xml:space="preserve"> </w:t>
+      </w:r>
+      <w:r>
+        <w:rPr>
+          <w:bCs/>
+          <w:b/>
+        </w:rPr>
+        <w:t xml:space="preserve">IRR</w:t>
+      </w:r>
+      <w:r>
         <w:t xml:space="preserve">.</w:t>
       </w:r>
     </w:p>
@@ -2434,205 +3660,102 @@
       <w:pPr>
         <w:numPr>
           <w:ilvl w:val="0"/>
-          <w:numId w:val="1003"/>
-        </w:numPr>
-        <w:pStyle w:val="Compact"/>
-      </w:pPr>
-      <w:r>
-        <w:t xml:space="preserve">DFN = projected assets − projected liabilities − projected equity.</w:t>
-      </w:r>
-    </w:p>
-    <w:p>
-      <w:pPr>
-        <w:numPr>
-          <w:ilvl w:val="0"/>
-          <w:numId w:val="1003"/>
-        </w:numPr>
-        <w:pStyle w:val="Compact"/>
-      </w:pPr>
-      <w:r>
-        <w:rPr>
-          <w:bCs/>
-          <w:b/>
-        </w:rPr>
-        <w:t xml:space="preserve">Lumpy assets</w:t>
-      </w:r>
-      <w:r>
-        <w:t xml:space="preserve"> </w:t>
-      </w:r>
-      <w:r>
-        <w:t xml:space="preserve">= purchased in large non-divisible chunks (new machine/factory).</w:t>
-      </w:r>
-    </w:p>
-    <w:p>
-      <w:pPr>
-        <w:numPr>
-          <w:ilvl w:val="0"/>
-          <w:numId w:val="1003"/>
-        </w:numPr>
-        <w:pStyle w:val="Compact"/>
-      </w:pPr>
-      <w:r>
-        <w:t xml:space="preserve">Higher retention &amp; higher ROE → higher SGR; firms dislike issuing new shares (dilution/price hit).</w:t>
-      </w:r>
-    </w:p>
-    <w:p>
-      <w:pPr>
-        <w:numPr>
-          <w:ilvl w:val="0"/>
-          <w:numId w:val="1003"/>
-        </w:numPr>
-        <w:pStyle w:val="Compact"/>
-      </w:pPr>
-      <w:r>
-        <w:t xml:space="preserve">Higher earnings retained → more internal equity →</w:t>
-      </w:r>
-      <w:r>
-        <w:t xml:space="preserve"> </w:t>
-      </w:r>
-      <w:r>
-        <w:rPr>
-          <w:bCs/>
-          <w:b/>
-        </w:rPr>
-        <w:t xml:space="preserve">decreases DFN</w:t>
+          <w:numId w:val="1004"/>
+        </w:numPr>
+        <w:pStyle w:val="Compact"/>
+      </w:pPr>
+      <w:r>
+        <w:t xml:space="preserve">NPV vs IRR conflict →</w:t>
+      </w:r>
+      <w:r>
+        <w:t xml:space="preserve"> </w:t>
+      </w:r>
+      <w:r>
+        <w:rPr>
+          <w:bCs/>
+          <w:b/>
+        </w:rPr>
+        <w:t xml:space="preserve">NPV wins</w:t>
+      </w:r>
+      <w:r>
+        <w:t xml:space="preserve">; IRR cannot choose mutually exclusive projects.</w:t>
+      </w:r>
+    </w:p>
+    <w:p>
+      <w:pPr>
+        <w:numPr>
+          <w:ilvl w:val="0"/>
+          <w:numId w:val="1004"/>
+        </w:numPr>
+        <w:pStyle w:val="Compact"/>
+      </w:pPr>
+      <w:r>
+        <w:t xml:space="preserve">PI = PV(inflows) / initial outlay; value</w:t>
+      </w:r>
+      <w:r>
+        <w:t xml:space="preserve"> </w:t>
+      </w:r>
+      <w:r>
+        <w:rPr>
+          <w:bCs/>
+          <w:b/>
+        </w:rPr>
+        <w:t xml:space="preserve">efficiency</w:t>
+      </w:r>
+      <w:r>
+        <w:t xml:space="preserve"> </w:t>
+      </w:r>
+      <w:r>
+        <w:t xml:space="preserve">per dollar.</w:t>
+      </w:r>
+    </w:p>
+    <w:p>
+      <w:pPr>
+        <w:numPr>
+          <w:ilvl w:val="0"/>
+          <w:numId w:val="1004"/>
+        </w:numPr>
+        <w:pStyle w:val="Compact"/>
+      </w:pPr>
+      <w:r>
+        <w:t xml:space="preserve">Debt: tax shield, no ownership given up; Equity: no fixed repayment, dilution risk.</w:t>
+      </w:r>
+    </w:p>
+    <w:p>
+      <w:pPr>
+        <w:numPr>
+          <w:ilvl w:val="0"/>
+          <w:numId w:val="1004"/>
+        </w:numPr>
+        <w:pStyle w:val="Compact"/>
+      </w:pPr>
+      <w:r>
+        <w:t xml:space="preserve">Preferred = perpetuity; common = Gordon/constant growth; bond = PV of cash flows; CAPM for expected return.</w:t>
+      </w:r>
+    </w:p>
+    <w:p>
+      <w:pPr>
+        <w:numPr>
+          <w:ilvl w:val="0"/>
+          <w:numId w:val="1004"/>
+        </w:numPr>
+        <w:pStyle w:val="Compact"/>
+      </w:pPr>
+      <w:r>
+        <w:t xml:space="preserve">Intrinsic &gt; market → underpriced; include opportunity costs &amp; cannibalization;</w:t>
+      </w:r>
+      <w:r>
+        <w:t xml:space="preserve"> </w:t>
+      </w:r>
+      <w:r>
+        <w:rPr>
+          <w:bCs/>
+          <w:b/>
+        </w:rPr>
+        <w:t xml:space="preserve">exclude sunk costs</w:t>
       </w:r>
       <w:r>
         <w:t xml:space="preserve">.</w:t>
-      </w:r>
-    </w:p>
-    <w:p>
-      <w:pPr>
-        <w:numPr>
-          <w:ilvl w:val="0"/>
-          <w:numId w:val="1003"/>
-        </w:numPr>
-        <w:pStyle w:val="Compact"/>
-      </w:pPr>
-      <w:r>
-        <w:t xml:space="preserve">Interest expense on pro formas can be independent of sales/operations.</w:t>
-      </w:r>
-    </w:p>
-    <w:bookmarkEnd w:id="30"/>
-    <w:bookmarkStart w:id="31" w:name="unit-6-cohort-instructor"/>
-    <w:p>
-      <w:pPr>
-        <w:pStyle w:val="Heading3"/>
-      </w:pPr>
-      <w:r>
-        <w:t xml:space="preserve">Unit 6 Cohort (instructor)</w:t>
-      </w:r>
-    </w:p>
-    <w:p>
-      <w:pPr>
-        <w:numPr>
-          <w:ilvl w:val="0"/>
-          <w:numId w:val="1004"/>
-        </w:numPr>
-        <w:pStyle w:val="Compact"/>
-      </w:pPr>
-      <w:r>
-        <w:t xml:space="preserve">OA is about</w:t>
-      </w:r>
-      <w:r>
-        <w:t xml:space="preserve"> </w:t>
-      </w:r>
-      <w:r>
-        <w:rPr>
-          <w:bCs/>
-          <w:b/>
-        </w:rPr>
-        <w:t xml:space="preserve">application</w:t>
-      </w:r>
-      <w:r>
-        <w:t xml:space="preserve">, not just terminology.</w:t>
-      </w:r>
-    </w:p>
-    <w:p>
-      <w:pPr>
-        <w:numPr>
-          <w:ilvl w:val="0"/>
-          <w:numId w:val="1004"/>
-        </w:numPr>
-        <w:pStyle w:val="Compact"/>
-      </w:pPr>
-      <w:r>
-        <w:rPr>
-          <w:bCs/>
-          <w:b/>
-        </w:rPr>
-        <w:t xml:space="preserve">One project / choose one</w:t>
-      </w:r>
-      <w:r>
-        <w:t xml:space="preserve"> </w:t>
-      </w:r>
-      <w:r>
-        <w:t xml:space="preserve">→ start with</w:t>
-      </w:r>
-      <w:r>
-        <w:t xml:space="preserve"> </w:t>
-      </w:r>
-      <w:r>
-        <w:rPr>
-          <w:bCs/>
-          <w:b/>
-        </w:rPr>
-        <w:t xml:space="preserve">NPV</w:t>
-      </w:r>
-      <w:r>
-        <w:t xml:space="preserve"> </w:t>
-      </w:r>
-      <w:r>
-        <w:t xml:space="preserve">(exact $ value added).</w:t>
-      </w:r>
-    </w:p>
-    <w:p>
-      <w:pPr>
-        <w:numPr>
-          <w:ilvl w:val="0"/>
-          <w:numId w:val="1004"/>
-        </w:numPr>
-        <w:pStyle w:val="Compact"/>
-      </w:pPr>
-      <w:r>
-        <w:t xml:space="preserve">NPV advantages: all CFs, TVM, cost of capital/risk built in. Disadvantages: hard cost of capital; bad for different sizes.</w:t>
-      </w:r>
-    </w:p>
-    <w:p>
-      <w:pPr>
-        <w:numPr>
-          <w:ilvl w:val="0"/>
-          <w:numId w:val="1004"/>
-        </w:numPr>
-        <w:pStyle w:val="Compact"/>
-      </w:pPr>
-      <w:r>
-        <w:t xml:space="preserve">IRR easy as %; don’t use for mutually exclusive or multiple-IRR projects; prefer NPV when conflict.</w:t>
-      </w:r>
-    </w:p>
-    <w:p>
-      <w:pPr>
-        <w:numPr>
-          <w:ilvl w:val="0"/>
-          <w:numId w:val="1004"/>
-        </w:numPr>
-        <w:pStyle w:val="Compact"/>
-      </w:pPr>
-      <w:r>
-        <w:t xml:space="preserve">PI = benefit/cost ratio; best when</w:t>
-      </w:r>
-      <w:r>
-        <w:t xml:space="preserve"> </w:t>
-      </w:r>
-      <w:r>
-        <w:rPr>
-          <w:bCs/>
-          <w:b/>
-        </w:rPr>
-        <w:t xml:space="preserve">budget constraints</w:t>
-      </w:r>
-      <w:r>
-        <w:t xml:space="preserve">; prioritize highest PI.</w:t>
       </w:r>
     </w:p>
     <w:p>
@@ -2654,10 +3777,10 @@
         </w:pict>
       </w:r>
     </w:p>
-    <w:bookmarkEnd w:id="31"/>
     <w:bookmarkEnd w:id="32"/>
     <w:bookmarkEnd w:id="33"/>
-    <w:bookmarkStart w:id="59" w:name="unit-2-foundations-of-finance"/>
+    <w:bookmarkEnd w:id="34"/>
+    <w:bookmarkStart w:id="60" w:name="unit-2-foundations-of-finance"/>
     <w:p>
       <w:pPr>
         <w:pStyle w:val="Heading1"/>
@@ -2666,7 +3789,7 @@
         <w:t xml:space="preserve">Unit 2 — Foundations of Finance</w:t>
       </w:r>
     </w:p>
-    <w:bookmarkStart w:id="44" w:name="key-concepts-to-remember"/>
+    <w:bookmarkStart w:id="45" w:name="key-concepts-to-remember"/>
     <w:p>
       <w:pPr>
         <w:pStyle w:val="Heading2"/>
@@ -2675,7 +3798,7 @@
         <w:t xml:space="preserve">Key Concepts to Remember</w:t>
       </w:r>
     </w:p>
-    <w:bookmarkStart w:id="34" w:name="areas-of-finance"/>
+    <w:bookmarkStart w:id="35" w:name="areas-of-finance"/>
     <w:p>
       <w:pPr>
         <w:pStyle w:val="Heading3"/>
@@ -2922,8 +4045,8 @@
         </w:tc>
       </w:tr>
     </w:tbl>
-    <w:bookmarkEnd w:id="34"/>
-    <w:bookmarkStart w:id="35" w:name="finance-vs-accounting-must-know"/>
+    <w:bookmarkEnd w:id="35"/>
+    <w:bookmarkStart w:id="36" w:name="finance-vs-accounting-must-know"/>
     <w:p>
       <w:pPr>
         <w:pStyle w:val="Heading3"/>
@@ -3078,8 +4201,8 @@
         </w:tc>
       </w:tr>
     </w:tbl>
-    <w:bookmarkEnd w:id="35"/>
-    <w:bookmarkStart w:id="36" w:name="goals-firm-vs-personal-finance"/>
+    <w:bookmarkEnd w:id="36"/>
+    <w:bookmarkStart w:id="37" w:name="goals-firm-vs-personal-finance"/>
     <w:p>
       <w:pPr>
         <w:pStyle w:val="Heading3"/>
@@ -3396,8 +4519,8 @@
         <w:t xml:space="preserve">to achieve financial goals</w:t>
       </w:r>
     </w:p>
-    <w:bookmarkEnd w:id="36"/>
-    <w:bookmarkStart w:id="37" w:name="X7f3a30957f1c7f46f655deb1ffd8f3eaac19f47"/>
+    <w:bookmarkEnd w:id="37"/>
+    <w:bookmarkStart w:id="38" w:name="X7f3a30957f1c7f46f655deb1ffd8f3eaac19f47"/>
     <w:p>
       <w:pPr>
         <w:pStyle w:val="Heading3"/>
@@ -3602,8 +4725,8 @@
         </w:tc>
       </w:tr>
     </w:tbl>
-    <w:bookmarkEnd w:id="37"/>
-    <w:bookmarkStart w:id="38" w:name="financial-markets-regulation"/>
+    <w:bookmarkEnd w:id="38"/>
+    <w:bookmarkStart w:id="39" w:name="financial-markets-regulation"/>
     <w:p>
       <w:pPr>
         <w:pStyle w:val="Heading3"/>
@@ -3892,8 +5015,8 @@
         </w:tc>
       </w:tr>
     </w:tbl>
-    <w:bookmarkEnd w:id="38"/>
-    <w:bookmarkStart w:id="39" w:name="types-of-financial-institutions"/>
+    <w:bookmarkEnd w:id="39"/>
+    <w:bookmarkStart w:id="40" w:name="types-of-financial-institutions"/>
     <w:p>
       <w:pPr>
         <w:pStyle w:val="Heading3"/>
@@ -4353,8 +5476,8 @@
         </w:tc>
       </w:tr>
     </w:tbl>
-    <w:bookmarkEnd w:id="39"/>
-    <w:bookmarkStart w:id="40" w:name="X912f4dcc9d2dabe5c64d75b8f3e119684d95f31"/>
+    <w:bookmarkEnd w:id="40"/>
+    <w:bookmarkStart w:id="41" w:name="X912f4dcc9d2dabe5c64d75b8f3e119684d95f31"/>
     <w:p>
       <w:pPr>
         <w:pStyle w:val="Heading3"/>
@@ -4713,8 +5836,8 @@
         <w:t xml:space="preserve">Leading = ahead | Coincident = with | Lagging = behind</w:t>
       </w:r>
     </w:p>
-    <w:bookmarkEnd w:id="40"/>
-    <w:bookmarkStart w:id="41" w:name="ethics-terms-distinguish-carefully"/>
+    <w:bookmarkEnd w:id="41"/>
+    <w:bookmarkStart w:id="42" w:name="ethics-terms-distinguish-carefully"/>
     <w:p>
       <w:pPr>
         <w:pStyle w:val="Heading3"/>
@@ -5203,8 +6326,8 @@
         <w:t xml:space="preserve">and don’t hide alternatives</w:t>
       </w:r>
     </w:p>
-    <w:bookmarkEnd w:id="41"/>
-    <w:bookmarkStart w:id="42" w:name="steps-to-solve-an-ethical-dilemma"/>
+    <w:bookmarkEnd w:id="42"/>
+    <w:bookmarkStart w:id="43" w:name="steps-to-solve-an-ethical-dilemma"/>
     <w:p>
       <w:pPr>
         <w:pStyle w:val="Heading3"/>
@@ -5306,8 +6429,8 @@
         <w:t xml:space="preserve">Move forward with the chosen course of action</w:t>
       </w:r>
     </w:p>
-    <w:bookmarkEnd w:id="42"/>
-    <w:bookmarkStart w:id="43" w:name="agency-problems-bondholders"/>
+    <w:bookmarkEnd w:id="43"/>
+    <w:bookmarkStart w:id="44" w:name="agency-problems-bondholders"/>
     <w:p>
       <w:pPr>
         <w:pStyle w:val="Heading3"/>
@@ -5631,9 +6754,9 @@
         </w:pict>
       </w:r>
     </w:p>
-    <w:bookmarkEnd w:id="43"/>
     <w:bookmarkEnd w:id="44"/>
-    <w:bookmarkStart w:id="45" w:name="practice-questions-unit-2-form-a"/>
+    <w:bookmarkEnd w:id="45"/>
+    <w:bookmarkStart w:id="46" w:name="practice-questions-unit-2-form-a"/>
     <w:p>
       <w:pPr>
         <w:pStyle w:val="Heading2"/>
@@ -5896,8 +7019,8 @@
         </w:pict>
       </w:r>
     </w:p>
-    <w:bookmarkEnd w:id="45"/>
-    <w:bookmarkStart w:id="46" w:name="practice-questions-unit-2-form-b"/>
+    <w:bookmarkEnd w:id="46"/>
+    <w:bookmarkStart w:id="47" w:name="practice-questions-unit-2-form-b"/>
     <w:p>
       <w:pPr>
         <w:pStyle w:val="Heading2"/>
@@ -6160,8 +7283,8 @@
         </w:pict>
       </w:r>
     </w:p>
-    <w:bookmarkEnd w:id="46"/>
-    <w:bookmarkStart w:id="47" w:name="Xba88da9890fb3e3a8214d08eb27f9e2df468aff"/>
+    <w:bookmarkEnd w:id="47"/>
+    <w:bookmarkStart w:id="48" w:name="Xba88da9890fb3e3a8214d08eb27f9e2df468aff"/>
     <w:p>
       <w:pPr>
         <w:pStyle w:val="Heading2"/>
@@ -6231,8 +7354,8 @@
         </w:pict>
       </w:r>
     </w:p>
-    <w:bookmarkEnd w:id="47"/>
-    <w:bookmarkStart w:id="57" w:name="Xf8900dbd1de6c267585f93fae26a98a85ca73bc"/>
+    <w:bookmarkEnd w:id="48"/>
+    <w:bookmarkStart w:id="58" w:name="Xf8900dbd1de6c267585f93fae26a98a85ca73bc"/>
     <w:p>
       <w:pPr>
         <w:pStyle w:val="Heading2"/>
@@ -6241,7 +7364,7 @@
         <w:t xml:space="preserve">Practice Questions — Unit 2 Module Assessment Section 1 (new batch)</w:t>
       </w:r>
     </w:p>
-    <w:bookmarkStart w:id="48" w:name="X1596fcb0fb93749278bf2ccb9e8c0d98a87d703"/>
+    <w:bookmarkStart w:id="49" w:name="X1596fcb0fb93749278bf2ccb9e8c0d98a87d703"/>
     <w:p>
       <w:pPr>
         <w:pStyle w:val="Heading3"/>
@@ -6322,8 +7445,8 @@
         <w:t xml:space="preserve">Investments</w:t>
       </w:r>
     </w:p>
-    <w:bookmarkEnd w:id="48"/>
-    <w:bookmarkStart w:id="49" w:name="goals"/>
+    <w:bookmarkEnd w:id="49"/>
+    <w:bookmarkStart w:id="50" w:name="goals"/>
     <w:p>
       <w:pPr>
         <w:pStyle w:val="Heading3"/>
@@ -6410,8 +7533,8 @@
         <w:t xml:space="preserve">(= utility)</w:t>
       </w:r>
     </w:p>
-    <w:bookmarkEnd w:id="49"/>
-    <w:bookmarkStart w:id="50" w:name="manager-tasks-careers"/>
+    <w:bookmarkEnd w:id="50"/>
+    <w:bookmarkStart w:id="51" w:name="manager-tasks-careers"/>
     <w:p>
       <w:pPr>
         <w:pStyle w:val="Heading3"/>
@@ -6492,8 +7615,8 @@
         <w:t xml:space="preserve">Making investment decisions</w:t>
       </w:r>
     </w:p>
-    <w:bookmarkEnd w:id="50"/>
-    <w:bookmarkStart w:id="51" w:name="personal-cash-tools"/>
+    <w:bookmarkEnd w:id="51"/>
+    <w:bookmarkStart w:id="52" w:name="personal-cash-tools"/>
     <w:p>
       <w:pPr>
         <w:pStyle w:val="Heading3"/>
@@ -6574,8 +7697,8 @@
         <w:t xml:space="preserve">Financing</w:t>
       </w:r>
     </w:p>
-    <w:bookmarkEnd w:id="51"/>
-    <w:bookmarkStart w:id="52" w:name="markets"/>
+    <w:bookmarkEnd w:id="52"/>
+    <w:bookmarkStart w:id="53" w:name="markets"/>
     <w:p>
       <w:pPr>
         <w:pStyle w:val="Heading3"/>
@@ -6681,8 +7804,8 @@
         <w:t xml:space="preserve">Primary market</w:t>
       </w:r>
     </w:p>
-    <w:bookmarkEnd w:id="52"/>
-    <w:bookmarkStart w:id="53" w:name="institutions-roles"/>
+    <w:bookmarkEnd w:id="53"/>
+    <w:bookmarkStart w:id="54" w:name="institutions-roles"/>
     <w:p>
       <w:pPr>
         <w:pStyle w:val="Heading3"/>
@@ -6838,8 +7961,8 @@
         <w:t xml:space="preserve">Investment bank</w:t>
       </w:r>
     </w:p>
-    <w:bookmarkEnd w:id="53"/>
-    <w:bookmarkStart w:id="54" w:name="indicators-fed"/>
+    <w:bookmarkEnd w:id="54"/>
+    <w:bookmarkStart w:id="55" w:name="indicators-fed"/>
     <w:p>
       <w:pPr>
         <w:pStyle w:val="Heading3"/>
@@ -6945,8 +8068,8 @@
         <w:t xml:space="preserve">Analyzed during economic shifts to provide information about the current state of the economy</w:t>
       </w:r>
     </w:p>
-    <w:bookmarkEnd w:id="54"/>
-    <w:bookmarkStart w:id="55" w:name="ethics-distinctions-dilemmas"/>
+    <w:bookmarkEnd w:id="55"/>
+    <w:bookmarkStart w:id="56" w:name="ethics-distinctions-dilemmas"/>
     <w:p>
       <w:pPr>
         <w:pStyle w:val="Heading3"/>
@@ -7133,8 +8256,8 @@
         <w:t xml:space="preserve">Paying inadequate wages to workers overseas</w:t>
       </w:r>
     </w:p>
-    <w:bookmarkEnd w:id="55"/>
-    <w:bookmarkStart w:id="56" w:name="bondholders-agency-ethical-steps"/>
+    <w:bookmarkEnd w:id="56"/>
+    <w:bookmarkStart w:id="57" w:name="bondholders-agency-ethical-steps"/>
     <w:p>
       <w:pPr>
         <w:pStyle w:val="Heading3"/>
@@ -7282,9 +8405,9 @@
         </w:pict>
       </w:r>
     </w:p>
-    <w:bookmarkEnd w:id="56"/>
     <w:bookmarkEnd w:id="57"/>
-    <w:bookmarkStart w:id="58" w:name="quick-memory-hooks-unit-2"/>
+    <w:bookmarkEnd w:id="58"/>
+    <w:bookmarkStart w:id="59" w:name="quick-memory-hooks-unit-2"/>
     <w:p>
       <w:pPr>
         <w:pStyle w:val="Heading2"/>
@@ -7936,9 +9059,9 @@
         </w:pict>
       </w:r>
     </w:p>
-    <w:bookmarkEnd w:id="58"/>
     <w:bookmarkEnd w:id="59"/>
-    <w:bookmarkStart w:id="72" w:name="X41374fbd87741e134179e75c4892d7bb26cc0c0"/>
+    <w:bookmarkEnd w:id="60"/>
+    <w:bookmarkStart w:id="73" w:name="X41374fbd87741e134179e75c4892d7bb26cc0c0"/>
     <w:p>
       <w:pPr>
         <w:pStyle w:val="Heading1"/>
@@ -7959,7 +9082,7 @@
         <w:t xml:space="preserve">(OA-heavy area per Reddit: interest rate / required rate / inflation often ~30%)</w:t>
       </w:r>
     </w:p>
-    <w:bookmarkStart w:id="64" w:name="key-concepts-to-remember-1"/>
+    <w:bookmarkStart w:id="65" w:name="key-concepts-to-remember-1"/>
     <w:p>
       <w:pPr>
         <w:pStyle w:val="Heading2"/>
@@ -7968,7 +9091,7 @@
         <w:t xml:space="preserve">Key Concepts to Remember</w:t>
       </w:r>
     </w:p>
-    <w:bookmarkStart w:id="60" w:name="interest-rate-definition-purpose"/>
+    <w:bookmarkStart w:id="61" w:name="interest-rate-definition-purpose"/>
     <w:p>
       <w:pPr>
         <w:pStyle w:val="Heading3"/>
@@ -8192,8 +9315,8 @@
         </w:tc>
       </w:tr>
     </w:tbl>
-    <w:bookmarkEnd w:id="60"/>
-    <w:bookmarkStart w:id="61" w:name="required-rate-of-return-components"/>
+    <w:bookmarkEnd w:id="61"/>
+    <w:bookmarkStart w:id="62" w:name="required-rate-of-return-components"/>
     <w:p>
       <w:pPr>
         <w:pStyle w:val="Heading3"/>
@@ -8477,8 +9600,8 @@
         </w:tc>
       </w:tr>
     </w:tbl>
-    <w:bookmarkEnd w:id="61"/>
-    <w:bookmarkStart w:id="62" w:name="inflation"/>
+    <w:bookmarkEnd w:id="62"/>
+    <w:bookmarkStart w:id="63" w:name="inflation"/>
     <w:p>
       <w:pPr>
         <w:pStyle w:val="Heading3"/>
@@ -8656,8 +9779,8 @@
         </w:tc>
       </w:tr>
     </w:tbl>
-    <w:bookmarkEnd w:id="62"/>
-    <w:bookmarkStart w:id="63" w:name="X8bb48f0f8561d439a0151468b9a90cf9fc889bd"/>
+    <w:bookmarkEnd w:id="63"/>
+    <w:bookmarkStart w:id="64" w:name="X8bb48f0f8561d439a0151468b9a90cf9fc889bd"/>
     <w:p>
       <w:pPr>
         <w:pStyle w:val="Heading3"/>
@@ -9197,9 +10320,9 @@
         </w:pict>
       </w:r>
     </w:p>
-    <w:bookmarkEnd w:id="63"/>
     <w:bookmarkEnd w:id="64"/>
-    <w:bookmarkStart w:id="70" w:name="X529eab95ede39b9533e6e8441b6663c3bfff063"/>
+    <w:bookmarkEnd w:id="65"/>
+    <w:bookmarkStart w:id="71" w:name="X529eab95ede39b9533e6e8441b6663c3bfff063"/>
     <w:p>
       <w:pPr>
         <w:pStyle w:val="Heading2"/>
@@ -9208,7 +10331,7 @@
         <w:t xml:space="preserve">Practice Questions — Unit 3 Assessment Section 1</w:t>
       </w:r>
     </w:p>
-    <w:bookmarkStart w:id="65" w:name="interest-rate-basics"/>
+    <w:bookmarkStart w:id="66" w:name="interest-rate-basics"/>
     <w:p>
       <w:pPr>
         <w:pStyle w:val="Heading3"/>
@@ -9289,8 +10412,8 @@
         <w:t xml:space="preserve">Allows borrowers to pay to use the assets of another entity to accomplish their own goals</w:t>
       </w:r>
     </w:p>
-    <w:bookmarkEnd w:id="65"/>
-    <w:bookmarkStart w:id="66" w:name="X177e111d81906cdb4fd38880c1e9a09c56a0b50"/>
+    <w:bookmarkEnd w:id="66"/>
+    <w:bookmarkStart w:id="67" w:name="X177e111d81906cdb4fd38880c1e9a09c56a0b50"/>
     <w:p>
       <w:pPr>
         <w:pStyle w:val="Heading3"/>
@@ -9402,8 +10525,8 @@
         <w:t xml:space="preserve">Inflation</w:t>
       </w:r>
     </w:p>
-    <w:bookmarkEnd w:id="66"/>
-    <w:bookmarkStart w:id="67" w:name="inflation-causes-effects"/>
+    <w:bookmarkEnd w:id="67"/>
+    <w:bookmarkStart w:id="68" w:name="inflation-causes-effects"/>
     <w:p>
       <w:pPr>
         <w:pStyle w:val="Heading3"/>
@@ -9484,8 +10607,8 @@
         <w:t xml:space="preserve">Prices rise</w:t>
       </w:r>
     </w:p>
-    <w:bookmarkEnd w:id="67"/>
-    <w:bookmarkStart w:id="68" w:name="risk-premium-nominal-risk-free"/>
+    <w:bookmarkEnd w:id="68"/>
+    <w:bookmarkStart w:id="69" w:name="risk-premium-nominal-risk-free"/>
     <w:p>
       <w:pPr>
         <w:pStyle w:val="Heading3"/>
@@ -9566,8 +10689,8 @@
         <w:t xml:space="preserve">Risk-free rate</w:t>
       </w:r>
     </w:p>
-    <w:bookmarkEnd w:id="68"/>
-    <w:bookmarkStart w:id="69" w:name="Xa0fa1db368d8369c7ad6badef3636841d4c7f4c"/>
+    <w:bookmarkEnd w:id="69"/>
+    <w:bookmarkStart w:id="70" w:name="Xa0fa1db368d8369c7ad6badef3636841d4c7f4c"/>
     <w:p>
       <w:pPr>
         <w:pStyle w:val="Heading3"/>
@@ -9711,9 +10834,9 @@
         </w:pict>
       </w:r>
     </w:p>
-    <w:bookmarkEnd w:id="69"/>
     <w:bookmarkEnd w:id="70"/>
-    <w:bookmarkStart w:id="71" w:name="quick-memory-hooks-unit-3-so-far"/>
+    <w:bookmarkEnd w:id="71"/>
+    <w:bookmarkStart w:id="72" w:name="quick-memory-hooks-unit-3-so-far"/>
     <w:p>
       <w:pPr>
         <w:pStyle w:val="Heading2"/>
@@ -10181,9 +11304,9 @@
         </w:pict>
       </w:r>
     </w:p>
-    <w:bookmarkEnd w:id="71"/>
     <w:bookmarkEnd w:id="72"/>
-    <w:bookmarkStart w:id="85" w:name="unit-3-time-value-of-money-tvm"/>
+    <w:bookmarkEnd w:id="73"/>
+    <w:bookmarkStart w:id="86" w:name="unit-3-time-value-of-money-tvm"/>
     <w:p>
       <w:pPr>
         <w:pStyle w:val="Heading1"/>
@@ -10192,7 +11315,7 @@
         <w:t xml:space="preserve">Unit 3 — Time Value of Money (TVM)</w:t>
       </w:r>
     </w:p>
-    <w:bookmarkStart w:id="79" w:name="key-concepts-to-remember-2"/>
+    <w:bookmarkStart w:id="80" w:name="key-concepts-to-remember-2"/>
     <w:p>
       <w:pPr>
         <w:pStyle w:val="Heading2"/>
@@ -10201,7 +11324,7 @@
         <w:t xml:space="preserve">Key Concepts to Remember</w:t>
       </w:r>
     </w:p>
-    <w:bookmarkStart w:id="73" w:name="tvm-core-idea"/>
+    <w:bookmarkStart w:id="74" w:name="tvm-core-idea"/>
     <w:p>
       <w:pPr>
         <w:pStyle w:val="Heading3"/>
@@ -10375,8 +11498,8 @@
         </w:tc>
       </w:tr>
     </w:tbl>
-    <w:bookmarkEnd w:id="73"/>
-    <w:bookmarkStart w:id="74" w:name="compounding-vs-discounting"/>
+    <w:bookmarkEnd w:id="74"/>
+    <w:bookmarkStart w:id="75" w:name="compounding-vs-discounting"/>
     <w:p>
       <w:pPr>
         <w:pStyle w:val="Heading3"/>
@@ -10555,8 +11678,8 @@
         </w:tc>
       </w:tr>
     </w:tbl>
-    <w:bookmarkEnd w:id="74"/>
-    <w:bookmarkStart w:id="75" w:name="annuities"/>
+    <w:bookmarkEnd w:id="75"/>
+    <w:bookmarkStart w:id="76" w:name="annuities"/>
     <w:p>
       <w:pPr>
         <w:pStyle w:val="Heading3"/>
@@ -10896,8 +12019,8 @@
         <w:t xml:space="preserve">”</w:t>
       </w:r>
     </w:p>
-    <w:bookmarkEnd w:id="75"/>
-    <w:bookmarkStart w:id="76" w:name="tvm-example-quiz"/>
+    <w:bookmarkEnd w:id="76"/>
+    <w:bookmarkStart w:id="77" w:name="tvm-example-quiz"/>
     <w:p>
       <w:pPr>
         <w:pStyle w:val="Heading3"/>
@@ -10965,8 +12088,8 @@
         <w:t xml:space="preserve">(worth of relative past cash flows; relative future to other cash flows)</w:t>
       </w:r>
     </w:p>
-    <w:bookmarkEnd w:id="76"/>
-    <w:bookmarkStart w:id="77" w:name="excel-tvm-functions-from-lesson-quizzes"/>
+    <w:bookmarkEnd w:id="77"/>
+    <w:bookmarkStart w:id="78" w:name="excel-tvm-functions-from-lesson-quizzes"/>
     <w:p>
       <w:pPr>
         <w:pStyle w:val="Heading3"/>
@@ -11722,8 +12845,8 @@
         <w:t xml:space="preserve">/ beginning → TYPE 1; end of period → TYPE 0; money leaving usually negative for PMT.</w:t>
       </w:r>
     </w:p>
-    <w:bookmarkEnd w:id="77"/>
-    <w:bookmarkStart w:id="78" w:name="tvm-in-business-personal-decisions"/>
+    <w:bookmarkEnd w:id="78"/>
+    <w:bookmarkStart w:id="79" w:name="tvm-in-business-personal-decisions"/>
     <w:p>
       <w:pPr>
         <w:pStyle w:val="Heading3"/>
@@ -12056,9 +13179,9 @@
         </w:pict>
       </w:r>
     </w:p>
-    <w:bookmarkEnd w:id="78"/>
     <w:bookmarkEnd w:id="79"/>
-    <w:bookmarkStart w:id="83" w:name="X1b228a8e05fe3fe39a7e0d718c4e87e778af5b7"/>
+    <w:bookmarkEnd w:id="80"/>
+    <w:bookmarkStart w:id="84" w:name="X1b228a8e05fe3fe39a7e0d718c4e87e778af5b7"/>
     <w:p>
       <w:pPr>
         <w:pStyle w:val="Heading2"/>
@@ -12155,7 +13278,7 @@
         <w:t xml:space="preserve">Time value of money</w:t>
       </w:r>
     </w:p>
-    <w:bookmarkStart w:id="80" w:name="tvm-decision-making-quiz"/>
+    <w:bookmarkStart w:id="81" w:name="tvm-decision-making-quiz"/>
     <w:p>
       <w:pPr>
         <w:pStyle w:val="Heading3"/>
@@ -12211,8 +13334,8 @@
         <w:t xml:space="preserve">Benefits of investments received at different times are comparable only when you consider the time value of money</w:t>
       </w:r>
     </w:p>
-    <w:bookmarkEnd w:id="80"/>
-    <w:bookmarkStart w:id="81" w:name="excel-tvm-functions-quiz"/>
+    <w:bookmarkEnd w:id="81"/>
+    <w:bookmarkStart w:id="82" w:name="excel-tvm-functions-quiz"/>
     <w:p>
       <w:pPr>
         <w:pStyle w:val="Heading3"/>
@@ -12306,8 +13429,8 @@
         <w:t xml:space="preserve">PV function</w:t>
       </w:r>
     </w:p>
-    <w:bookmarkEnd w:id="81"/>
-    <w:bookmarkStart w:id="82" w:name="Xd6b43cefa205da9223c65f6b91a472b3cfefb28"/>
+    <w:bookmarkEnd w:id="82"/>
+    <w:bookmarkStart w:id="83" w:name="Xd6b43cefa205da9223c65f6b91a472b3cfefb28"/>
     <w:p>
       <w:pPr>
         <w:pStyle w:val="Heading3"/>
@@ -12393,9 +13516,9 @@
         </w:pict>
       </w:r>
     </w:p>
-    <w:bookmarkEnd w:id="82"/>
     <w:bookmarkEnd w:id="83"/>
-    <w:bookmarkStart w:id="84" w:name="quick-memory-hooks-unit-3-tvm-so-far"/>
+    <w:bookmarkEnd w:id="84"/>
+    <w:bookmarkStart w:id="85" w:name="quick-memory-hooks-unit-3-tvm-so-far"/>
     <w:p>
       <w:pPr>
         <w:pStyle w:val="Heading2"/>
@@ -12846,9 +13969,9 @@
         </w:pict>
       </w:r>
     </w:p>
-    <w:bookmarkEnd w:id="84"/>
     <w:bookmarkEnd w:id="85"/>
-    <w:bookmarkStart w:id="88" w:name="unit-3-returns-new-from-this-batch"/>
+    <w:bookmarkEnd w:id="86"/>
+    <w:bookmarkStart w:id="89" w:name="unit-3-returns-new-from-this-batch"/>
     <w:p>
       <w:pPr>
         <w:pStyle w:val="Heading1"/>
@@ -12857,7 +13980,7 @@
         <w:t xml:space="preserve">Unit 3 — Returns (NEW from this batch)</w:t>
       </w:r>
     </w:p>
-    <w:bookmarkStart w:id="87" w:name="key-concepts"/>
+    <w:bookmarkStart w:id="88" w:name="key-concepts"/>
     <w:p>
       <w:pPr>
         <w:pStyle w:val="Heading2"/>
@@ -13141,7 +14264,7 @@
         <w:t xml:space="preserve">was higher.</w:t>
       </w:r>
     </w:p>
-    <w:bookmarkStart w:id="86" w:name="practice-returns"/>
+    <w:bookmarkStart w:id="87" w:name="practice-returns"/>
     <w:p>
       <w:pPr>
         <w:pStyle w:val="Heading3"/>
@@ -13254,10 +14377,10 @@
         </w:pict>
       </w:r>
     </w:p>
-    <w:bookmarkEnd w:id="86"/>
     <w:bookmarkEnd w:id="87"/>
     <w:bookmarkEnd w:id="88"/>
-    <w:bookmarkStart w:id="93" w:name="risk-market-firm-specific-reduction"/>
+    <w:bookmarkEnd w:id="89"/>
+    <w:bookmarkStart w:id="94" w:name="risk-market-firm-specific-reduction"/>
     <w:p>
       <w:pPr>
         <w:pStyle w:val="Heading1"/>
@@ -13266,7 +14389,7 @@
         <w:t xml:space="preserve">Risk (Market / Firm-Specific / Reduction)</w:t>
       </w:r>
     </w:p>
-    <w:bookmarkStart w:id="92" w:name="key-concepts-1"/>
+    <w:bookmarkStart w:id="93" w:name="key-concepts-1"/>
     <w:p>
       <w:pPr>
         <w:pStyle w:val="Heading2"/>
@@ -13568,7 +14691,7 @@
         </w:tc>
       </w:tr>
     </w:tbl>
-    <w:bookmarkStart w:id="89" w:name="risk-reduction-techniques"/>
+    <w:bookmarkStart w:id="90" w:name="risk-reduction-techniques"/>
     <w:p>
       <w:pPr>
         <w:pStyle w:val="Heading3"/>
@@ -13808,8 +14931,8 @@
         </w:tc>
       </w:tr>
     </w:tbl>
-    <w:bookmarkEnd w:id="89"/>
-    <w:bookmarkStart w:id="90" w:name="riskreturn-time"/>
+    <w:bookmarkEnd w:id="90"/>
+    <w:bookmarkStart w:id="91" w:name="riskreturn-time"/>
     <w:p>
       <w:pPr>
         <w:pStyle w:val="Heading3"/>
@@ -14025,8 +15148,8 @@
         </w:tc>
       </w:tr>
     </w:tbl>
-    <w:bookmarkEnd w:id="90"/>
-    <w:bookmarkStart w:id="91" w:name="practice-risk"/>
+    <w:bookmarkEnd w:id="91"/>
+    <w:bookmarkStart w:id="92" w:name="practice-risk"/>
     <w:p>
       <w:pPr>
         <w:pStyle w:val="Heading3"/>
@@ -14422,10 +15545,10 @@
         </w:pict>
       </w:r>
     </w:p>
-    <w:bookmarkEnd w:id="91"/>
     <w:bookmarkEnd w:id="92"/>
     <w:bookmarkEnd w:id="93"/>
-    <w:bookmarkStart w:id="101" w:name="ratio-analysis-oa-heavy"/>
+    <w:bookmarkEnd w:id="94"/>
+    <w:bookmarkStart w:id="102" w:name="ratio-analysis-oa-heavy"/>
     <w:p>
       <w:pPr>
         <w:pStyle w:val="Heading1"/>
@@ -14434,7 +15557,7 @@
         <w:t xml:space="preserve">Ratio Analysis (OA-heavy)</w:t>
       </w:r>
     </w:p>
-    <w:bookmarkStart w:id="95" w:name="why-ratios-matter"/>
+    <w:bookmarkStart w:id="96" w:name="why-ratios-matter"/>
     <w:p>
       <w:pPr>
         <w:pStyle w:val="Heading2"/>
@@ -14704,7 +15827,7 @@
         </w:tc>
       </w:tr>
     </w:tbl>
-    <w:bookmarkStart w:id="94" w:name="comparison-methods"/>
+    <w:bookmarkStart w:id="95" w:name="comparison-methods"/>
     <w:p>
       <w:pPr>
         <w:pStyle w:val="Heading3"/>
@@ -14910,9 +16033,9 @@
         </w:tc>
       </w:tr>
     </w:tbl>
-    <w:bookmarkEnd w:id="94"/>
     <w:bookmarkEnd w:id="95"/>
-    <w:bookmarkStart w:id="100" w:name="five-major-ratio-types"/>
+    <w:bookmarkEnd w:id="96"/>
+    <w:bookmarkStart w:id="101" w:name="five-major-ratio-types"/>
     <w:p>
       <w:pPr>
         <w:pStyle w:val="Heading2"/>
@@ -15170,7 +16293,7 @@
         </w:tc>
       </w:tr>
     </w:tbl>
-    <w:bookmarkStart w:id="96" w:name="key-specific-ratios"/>
+    <w:bookmarkStart w:id="97" w:name="key-specific-ratios"/>
     <w:p>
       <w:pPr>
         <w:pStyle w:val="Heading3"/>
@@ -15828,8 +16951,8 @@
         </w:tc>
       </w:tr>
     </w:tbl>
-    <w:bookmarkEnd w:id="96"/>
-    <w:bookmarkStart w:id="97" w:name="dupont-framework-must-know"/>
+    <w:bookmarkEnd w:id="97"/>
+    <w:bookmarkStart w:id="98" w:name="dupont-framework-must-know"/>
     <w:p>
       <w:pPr>
         <w:pStyle w:val="Heading3"/>
@@ -16211,8 +17334,8 @@
         </w:tc>
       </w:tr>
     </w:tbl>
-    <w:bookmarkEnd w:id="97"/>
-    <w:bookmarkStart w:id="98" w:name="extra-applications"/>
+    <w:bookmarkEnd w:id="98"/>
+    <w:bookmarkStart w:id="99" w:name="extra-applications"/>
     <w:p>
       <w:pPr>
         <w:pStyle w:val="Heading3"/>
@@ -16299,8 +17422,8 @@
         <w:t xml:space="preserve">standardization</w:t>
       </w:r>
     </w:p>
-    <w:bookmarkEnd w:id="98"/>
-    <w:bookmarkStart w:id="99" w:name="practice-ratios-selected-from-quizzes"/>
+    <w:bookmarkEnd w:id="99"/>
+    <w:bookmarkStart w:id="100" w:name="practice-ratios-selected-from-quizzes"/>
     <w:p>
       <w:pPr>
         <w:pStyle w:val="Heading3"/>
@@ -17407,10 +18530,10 @@
         </w:pict>
       </w:r>
     </w:p>
-    <w:bookmarkEnd w:id="99"/>
     <w:bookmarkEnd w:id="100"/>
     <w:bookmarkEnd w:id="101"/>
-    <w:bookmarkStart w:id="125" w:name="X02eb5aa3ba3bae1428c944c380fa089b7dae17c"/>
+    <w:bookmarkEnd w:id="102"/>
+    <w:bookmarkStart w:id="126" w:name="X02eb5aa3ba3bae1428c944c380fa089b7dae17c"/>
     <w:p>
       <w:pPr>
         <w:pStyle w:val="Heading1"/>
@@ -17419,7 +18542,7 @@
         <w:t xml:space="preserve">Unit 5 — Cash Budgeting &amp; Financial Forecasting (OA-heavy)</w:t>
       </w:r>
     </w:p>
-    <w:bookmarkStart w:id="111" w:name="a.-cash-budgeting-short-term"/>
+    <w:bookmarkStart w:id="112" w:name="a.-cash-budgeting-short-term"/>
     <w:p>
       <w:pPr>
         <w:pStyle w:val="Heading2"/>
@@ -17428,7 +18551,7 @@
         <w:t xml:space="preserve">A. Cash Budgeting (Short-term)</w:t>
       </w:r>
     </w:p>
-    <w:bookmarkStart w:id="102" w:name="what-horizon-uses"/>
+    <w:bookmarkStart w:id="103" w:name="what-horizon-uses"/>
     <w:p>
       <w:pPr>
         <w:pStyle w:val="Heading3"/>
@@ -17700,8 +18823,8 @@
         </w:tc>
       </w:tr>
     </w:tbl>
-    <w:bookmarkEnd w:id="102"/>
-    <w:bookmarkStart w:id="103" w:name="six-principles-of-personal-budgeting"/>
+    <w:bookmarkEnd w:id="103"/>
+    <w:bookmarkStart w:id="104" w:name="six-principles-of-personal-budgeting"/>
     <w:p>
       <w:pPr>
         <w:pStyle w:val="Heading3"/>
@@ -17829,8 +18952,8 @@
         <w:t xml:space="preserve">income, expenses, and savings</w:t>
       </w:r>
     </w:p>
-    <w:bookmarkEnd w:id="103"/>
-    <w:bookmarkStart w:id="104" w:name="creating-a-cash-budget-business-order"/>
+    <w:bookmarkEnd w:id="104"/>
+    <w:bookmarkStart w:id="105" w:name="creating-a-cash-budget-business-order"/>
     <w:p>
       <w:pPr>
         <w:pStyle w:val="Heading3"/>
@@ -17911,8 +19034,8 @@
         <w:t xml:space="preserve">cash receipts, cash disbursements, and borrowing</w:t>
       </w:r>
     </w:p>
-    <w:bookmarkEnd w:id="104"/>
-    <w:bookmarkStart w:id="105" w:name="personal-vs-business-budgeting-steps"/>
+    <w:bookmarkEnd w:id="105"/>
+    <w:bookmarkStart w:id="106" w:name="personal-vs-business-budgeting-steps"/>
     <w:p>
       <w:pPr>
         <w:pStyle w:val="Heading3"/>
@@ -17973,8 +19096,8 @@
         <w:t xml:space="preserve">Track → Monitor → Revise</w:t>
       </w:r>
     </w:p>
-    <w:bookmarkEnd w:id="105"/>
-    <w:bookmarkStart w:id="106" w:name="cash-receipts-vs-disbursements"/>
+    <w:bookmarkEnd w:id="106"/>
+    <w:bookmarkStart w:id="107" w:name="cash-receipts-vs-disbursements"/>
     <w:p>
       <w:pPr>
         <w:pStyle w:val="Heading3"/>
@@ -18323,8 +19446,8 @@
         <w:t xml:space="preserve">Example: $100k sales but $90k cash → firm did not make all sales on cash.</w:t>
       </w:r>
     </w:p>
-    <w:bookmarkEnd w:id="106"/>
-    <w:bookmarkStart w:id="107" w:name="fixed-expenses-goals-efficiency"/>
+    <w:bookmarkEnd w:id="107"/>
+    <w:bookmarkStart w:id="108" w:name="fixed-expenses-goals-efficiency"/>
     <w:p>
       <w:pPr>
         <w:pStyle w:val="Heading3"/>
@@ -18454,8 +19577,8 @@
         <w:t xml:space="preserve">prioritize and implement gradually, one by one</w:t>
       </w:r>
     </w:p>
-    <w:bookmarkEnd w:id="107"/>
-    <w:bookmarkStart w:id="108" w:name="tracking-monitoring-revision"/>
+    <w:bookmarkEnd w:id="108"/>
+    <w:bookmarkStart w:id="109" w:name="tracking-monitoring-revision"/>
     <w:p>
       <w:pPr>
         <w:pStyle w:val="Heading3"/>
@@ -18717,8 +19840,8 @@
         <w:t xml:space="preserve">Put budgeted cash for each expense category into labeled envelopes; spend only that category’s cash.</w:t>
       </w:r>
     </w:p>
-    <w:bookmarkEnd w:id="108"/>
-    <w:bookmarkStart w:id="109" w:name="borrowing-cash-position"/>
+    <w:bookmarkEnd w:id="109"/>
+    <w:bookmarkStart w:id="110" w:name="borrowing-cash-position"/>
     <w:p>
       <w:pPr>
         <w:pStyle w:val="Heading3"/>
@@ -18832,8 +19955,8 @@
         <w:t xml:space="preserve">Purpose of monthly cash budget: control inflows/outflows to balance income with expenditures and savings</w:t>
       </w:r>
     </w:p>
-    <w:bookmarkEnd w:id="109"/>
-    <w:bookmarkStart w:id="110" w:name="wh-case-hooks"/>
+    <w:bookmarkEnd w:id="110"/>
+    <w:bookmarkStart w:id="111" w:name="wh-case-hooks"/>
     <w:p>
       <w:pPr>
         <w:pStyle w:val="Heading3"/>
@@ -18911,9 +20034,9 @@
         </w:pict>
       </w:r>
     </w:p>
-    <w:bookmarkEnd w:id="110"/>
     <w:bookmarkEnd w:id="111"/>
-    <w:bookmarkStart w:id="118" w:name="b.-financial-forecasting-longer-term"/>
+    <w:bookmarkEnd w:id="112"/>
+    <w:bookmarkStart w:id="119" w:name="b.-financial-forecasting-longer-term"/>
     <w:p>
       <w:pPr>
         <w:pStyle w:val="Heading2"/>
@@ -18922,7 +20045,7 @@
         <w:t xml:space="preserve">B. Financial Forecasting (Longer-term)</w:t>
       </w:r>
     </w:p>
-    <w:bookmarkStart w:id="112" w:name="purpose-goal"/>
+    <w:bookmarkStart w:id="113" w:name="purpose-goal"/>
     <w:p>
       <w:pPr>
         <w:pStyle w:val="Heading3"/>
@@ -19140,8 +20263,8 @@
         </w:tc>
       </w:tr>
     </w:tbl>
-    <w:bookmarkEnd w:id="112"/>
-    <w:bookmarkStart w:id="113" w:name="spontaneous-vs-discretionary-accounts"/>
+    <w:bookmarkEnd w:id="113"/>
+    <w:bookmarkStart w:id="114" w:name="spontaneous-vs-discretionary-accounts"/>
     <w:p>
       <w:pPr>
         <w:pStyle w:val="Heading3"/>
@@ -19412,8 +20535,8 @@
         <w:t xml:space="preserve">If sales grow 10%/15% → increase spontaneous accounts (cash, AR, inventory, COGS) similarly; leave notes payable / LT liabilities constant unless management decides otherwise.</w:t>
       </w:r>
     </w:p>
-    <w:bookmarkEnd w:id="113"/>
-    <w:bookmarkStart w:id="114" w:name="percent-of-sales-dfn"/>
+    <w:bookmarkEnd w:id="114"/>
+    <w:bookmarkStart w:id="115" w:name="percent-of-sales-dfn"/>
     <w:p>
       <w:pPr>
         <w:pStyle w:val="Heading3"/>
@@ -19725,8 +20848,8 @@
         </w:tc>
       </w:tr>
     </w:tbl>
-    <w:bookmarkEnd w:id="114"/>
-    <w:bookmarkStart w:id="115" w:name="ways-to-decrease-dfn"/>
+    <w:bookmarkEnd w:id="115"/>
+    <w:bookmarkStart w:id="116" w:name="ways-to-decrease-dfn"/>
     <w:p>
       <w:pPr>
         <w:pStyle w:val="Heading3"/>
@@ -19831,8 +20954,8 @@
         <w:t xml:space="preserve">decrease DFN by decreasing retention / increasing dividend payout / decreasing net margin.</w:t>
       </w:r>
     </w:p>
-    <w:bookmarkEnd w:id="115"/>
-    <w:bookmarkStart w:id="116" w:name="sustainable-growth-rate-sgr"/>
+    <w:bookmarkEnd w:id="116"/>
+    <w:bookmarkStart w:id="117" w:name="sustainable-growth-rate-sgr"/>
     <w:p>
       <w:pPr>
         <w:pStyle w:val="Heading3"/>
@@ -20042,8 +21165,8 @@
         </w:tc>
       </w:tr>
     </w:tbl>
-    <w:bookmarkEnd w:id="116"/>
-    <w:bookmarkStart w:id="117" w:name="fixed-assets-capacity-lumpy-assets"/>
+    <w:bookmarkEnd w:id="117"/>
+    <w:bookmarkStart w:id="118" w:name="fixed-assets-capacity-lumpy-assets"/>
     <w:p>
       <w:pPr>
         <w:pStyle w:val="Heading3"/>
@@ -20236,9 +21359,9 @@
         </w:pict>
       </w:r>
     </w:p>
-    <w:bookmarkEnd w:id="117"/>
     <w:bookmarkEnd w:id="118"/>
-    <w:bookmarkStart w:id="123" w:name="practice-unit-5-key-qs-with-answers"/>
+    <w:bookmarkEnd w:id="119"/>
+    <w:bookmarkStart w:id="124" w:name="practice-unit-5-key-qs-with-answers"/>
     <w:p>
       <w:pPr>
         <w:pStyle w:val="Heading2"/>
@@ -20247,7 +21370,7 @@
         <w:t xml:space="preserve">Practice — Unit 5 (key Qs with answers)</w:t>
       </w:r>
     </w:p>
-    <w:bookmarkStart w:id="119" w:name="cash-budgeting"/>
+    <w:bookmarkStart w:id="120" w:name="cash-budgeting"/>
     <w:p>
       <w:pPr>
         <w:pStyle w:val="Heading3"/>
@@ -20731,8 +21854,8 @@
         <w:t xml:space="preserve">Tracking vs monitoring → monitoring uses tracking record to evaluate vs target/patterns</w:t>
       </w:r>
     </w:p>
-    <w:bookmarkEnd w:id="119"/>
-    <w:bookmarkStart w:id="120" w:name="unit-5-test-form-b-highlights"/>
+    <w:bookmarkEnd w:id="120"/>
+    <w:bookmarkStart w:id="121" w:name="unit-5-test-form-b-highlights"/>
     <w:p>
       <w:pPr>
         <w:pStyle w:val="Heading3"/>
@@ -20974,8 +22097,8 @@
         <w:t xml:space="preserve">lumpy</w:t>
       </w:r>
     </w:p>
-    <w:bookmarkEnd w:id="120"/>
-    <w:bookmarkStart w:id="121" w:name="unit-5-test-form-a-highlights"/>
+    <w:bookmarkEnd w:id="121"/>
+    <w:bookmarkStart w:id="122" w:name="unit-5-test-form-a-highlights"/>
     <w:p>
       <w:pPr>
         <w:pStyle w:val="Heading3"/>
@@ -21207,8 +22330,8 @@
         <w:t xml:space="preserve">asset, not just portion needed</w:t>
       </w:r>
     </w:p>
-    <w:bookmarkEnd w:id="121"/>
-    <w:bookmarkStart w:id="122" w:name="forecasting-dfn-sgr-quizzes"/>
+    <w:bookmarkEnd w:id="122"/>
+    <w:bookmarkStart w:id="123" w:name="forecasting-dfn-sgr-quizzes"/>
     <w:p>
       <w:pPr>
         <w:pStyle w:val="Heading3"/>
@@ -21682,9 +22805,9 @@
         </w:pict>
       </w:r>
     </w:p>
-    <w:bookmarkEnd w:id="122"/>
     <w:bookmarkEnd w:id="123"/>
-    <w:bookmarkStart w:id="124" w:name="quick-memory-hooks-unit-5"/>
+    <w:bookmarkEnd w:id="124"/>
+    <w:bookmarkStart w:id="125" w:name="quick-memory-hooks-unit-5"/>
     <w:p>
       <w:pPr>
         <w:pStyle w:val="Heading2"/>
@@ -21900,9 +23023,9 @@
         </w:pict>
       </w:r>
     </w:p>
-    <w:bookmarkEnd w:id="124"/>
     <w:bookmarkEnd w:id="125"/>
-    <w:bookmarkStart w:id="144" w:name="Xa34ab0d8e3b9e6dfad0748584855011fdded1bf"/>
+    <w:bookmarkEnd w:id="126"/>
+    <w:bookmarkStart w:id="145" w:name="Xa34ab0d8e3b9e6dfad0748584855011fdded1bf"/>
     <w:p>
       <w:pPr>
         <w:pStyle w:val="Heading1"/>
@@ -21911,7 +23034,7 @@
         <w:t xml:space="preserve">Unit 6 — Capital Budgeting, Valuation &amp; Project Cash Flows (OA-heavy)</w:t>
       </w:r>
     </w:p>
-    <w:bookmarkStart w:id="126" w:name="X0dc1472bfd159a954c90a1bbcf4f408b75a8461"/>
+    <w:bookmarkStart w:id="127" w:name="X0dc1472bfd159a954c90a1bbcf4f408b75a8461"/>
     <w:p>
       <w:pPr>
         <w:pStyle w:val="Heading2"/>
@@ -22215,8 +23338,8 @@
         </w:tc>
       </w:tr>
     </w:tbl>
-    <w:bookmarkEnd w:id="126"/>
-    <w:bookmarkStart w:id="127" w:name="npv-net-present-value"/>
+    <w:bookmarkEnd w:id="127"/>
+    <w:bookmarkStart w:id="128" w:name="npv-net-present-value"/>
     <w:p>
       <w:pPr>
         <w:pStyle w:val="Heading2"/>
@@ -22530,8 +23653,8 @@
         </w:tc>
       </w:tr>
     </w:tbl>
-    <w:bookmarkEnd w:id="127"/>
-    <w:bookmarkStart w:id="128" w:name="irr-internal-rate-of-return"/>
+    <w:bookmarkEnd w:id="128"/>
+    <w:bookmarkStart w:id="129" w:name="irr-internal-rate-of-return"/>
     <w:p>
       <w:pPr>
         <w:pStyle w:val="Heading2"/>
@@ -22799,8 +23922,8 @@
         </w:tc>
       </w:tr>
     </w:tbl>
-    <w:bookmarkEnd w:id="128"/>
-    <w:bookmarkStart w:id="129" w:name="pi-profitability-index"/>
+    <w:bookmarkEnd w:id="129"/>
+    <w:bookmarkStart w:id="130" w:name="pi-profitability-index"/>
     <w:p>
       <w:pPr>
         <w:pStyle w:val="Heading2"/>
@@ -23172,8 +24295,8 @@
         <w:t xml:space="preserve">NPV</w:t>
       </w:r>
     </w:p>
-    <w:bookmarkEnd w:id="129"/>
-    <w:bookmarkStart w:id="130" w:name="why-capital-returns-debt"/>
+    <w:bookmarkEnd w:id="130"/>
+    <w:bookmarkStart w:id="131" w:name="why-capital-returns-debt"/>
     <w:p>
       <w:pPr>
         <w:pStyle w:val="Heading2"/>
@@ -23489,8 +24612,8 @@
         </w:tc>
       </w:tr>
     </w:tbl>
-    <w:bookmarkEnd w:id="130"/>
-    <w:bookmarkStart w:id="131" w:name="bonds-stocks-valuation-basics"/>
+    <w:bookmarkEnd w:id="131"/>
+    <w:bookmarkStart w:id="132" w:name="bonds-stocks-valuation-basics"/>
     <w:p>
       <w:pPr>
         <w:pStyle w:val="Heading2"/>
@@ -23954,8 +25077,8 @@
         </w:tc>
       </w:tr>
     </w:tbl>
-    <w:bookmarkEnd w:id="131"/>
-    <w:bookmarkStart w:id="133" w:name="incremental-incidental-cannibalization"/>
+    <w:bookmarkEnd w:id="132"/>
+    <w:bookmarkStart w:id="134" w:name="incremental-incidental-cannibalization"/>
     <w:p>
       <w:pPr>
         <w:pStyle w:val="Heading2"/>
@@ -24385,7 +25508,7 @@
         <w:t xml:space="preserve">.</w:t>
       </w:r>
     </w:p>
-    <w:bookmarkStart w:id="132" w:name="Xda3cea9a0e12e3dc6bb908c232e96a048a5d740"/>
+    <w:bookmarkStart w:id="133" w:name="Xda3cea9a0e12e3dc6bb908c232e96a048a5d740"/>
     <w:p>
       <w:pPr>
         <w:pStyle w:val="Heading3"/>
@@ -25254,9 +26377,9 @@
         </w:pict>
       </w:r>
     </w:p>
-    <w:bookmarkEnd w:id="132"/>
     <w:bookmarkEnd w:id="133"/>
-    <w:bookmarkStart w:id="141" w:name="practice-unit-6-correct-answers"/>
+    <w:bookmarkEnd w:id="134"/>
+    <w:bookmarkStart w:id="142" w:name="practice-unit-6-correct-answers"/>
     <w:p>
       <w:pPr>
         <w:pStyle w:val="Heading2"/>
@@ -25265,7 +26388,7 @@
         <w:t xml:space="preserve">Practice — Unit 6 (correct answers)</w:t>
       </w:r>
     </w:p>
-    <w:bookmarkStart w:id="134" w:name="npv-irr-pi-basics"/>
+    <w:bookmarkStart w:id="135" w:name="npv-irr-pi-basics"/>
     <w:p>
       <w:pPr>
         <w:pStyle w:val="Heading3"/>
@@ -25592,8 +26715,8 @@
         <w:t xml:space="preserve">Higher cost of capital</w:t>
       </w:r>
     </w:p>
-    <w:bookmarkEnd w:id="134"/>
-    <w:bookmarkStart w:id="135" w:name="securities-capital-budgeting-definition"/>
+    <w:bookmarkEnd w:id="135"/>
+    <w:bookmarkStart w:id="136" w:name="securities-capital-budgeting-definition"/>
     <w:p>
       <w:pPr>
         <w:pStyle w:val="Heading3"/>
@@ -25786,8 +26909,8 @@
         <w:t xml:space="preserve">Capital budgeting</w:t>
       </w:r>
     </w:p>
-    <w:bookmarkEnd w:id="135"/>
-    <w:bookmarkStart w:id="136" w:name="module-ranking-applications"/>
+    <w:bookmarkEnd w:id="136"/>
+    <w:bookmarkStart w:id="137" w:name="module-ranking-applications"/>
     <w:p>
       <w:pPr>
         <w:pStyle w:val="Heading3"/>
@@ -25926,8 +27049,8 @@
         <w:t xml:space="preserve">(positive NPV)</w:t>
       </w:r>
     </w:p>
-    <w:bookmarkEnd w:id="136"/>
-    <w:bookmarkStart w:id="137" w:name="X171eb6c7f674373f52b34b373dc0d01c7e65fc6"/>
+    <w:bookmarkEnd w:id="137"/>
+    <w:bookmarkStart w:id="138" w:name="X171eb6c7f674373f52b34b373dc0d01c7e65fc6"/>
     <w:p>
       <w:pPr>
         <w:pStyle w:val="Heading3"/>
@@ -26004,8 +27127,8 @@
         <w:t xml:space="preserve">until capital used</w:t>
       </w:r>
     </w:p>
-    <w:bookmarkEnd w:id="137"/>
-    <w:bookmarkStart w:id="138" w:name="timing-opportunity-cost-financing"/>
+    <w:bookmarkEnd w:id="138"/>
+    <w:bookmarkStart w:id="139" w:name="timing-opportunity-cost-financing"/>
     <w:p>
       <w:pPr>
         <w:pStyle w:val="Heading3"/>
@@ -26162,8 +27285,8 @@
         <w:t xml:space="preserve">debt and equity</w:t>
       </w:r>
     </w:p>
-    <w:bookmarkEnd w:id="138"/>
-    <w:bookmarkStart w:id="139" w:name="incremental-cfs"/>
+    <w:bookmarkEnd w:id="139"/>
+    <w:bookmarkStart w:id="140" w:name="incremental-cfs"/>
     <w:p>
       <w:pPr>
         <w:pStyle w:val="Heading3"/>
@@ -26363,8 +27486,8 @@
         <w:t xml:space="preserve">Opportunity cost → can’t use asset for next best project once invested elsewhere</w:t>
       </w:r>
     </w:p>
-    <w:bookmarkEnd w:id="139"/>
-    <w:bookmarkStart w:id="140" w:name="assessment-section-12-new"/>
+    <w:bookmarkEnd w:id="140"/>
+    <w:bookmarkStart w:id="141" w:name="assessment-section-12-new"/>
     <w:p>
       <w:pPr>
         <w:pStyle w:val="Heading3"/>
@@ -26835,9 +27958,9 @@
         </w:pict>
       </w:r>
     </w:p>
-    <w:bookmarkEnd w:id="140"/>
     <w:bookmarkEnd w:id="141"/>
-    <w:bookmarkStart w:id="142" w:name="quick-memory-hooks-unit-6"/>
+    <w:bookmarkEnd w:id="142"/>
+    <w:bookmarkStart w:id="143" w:name="quick-memory-hooks-unit-6"/>
     <w:p>
       <w:pPr>
         <w:pStyle w:val="Heading2"/>
@@ -27127,8 +28250,8 @@
         </w:pict>
       </w:r>
     </w:p>
-    <w:bookmarkEnd w:id="142"/>
-    <w:bookmarkStart w:id="143" w:name="material-log"/>
+    <w:bookmarkEnd w:id="143"/>
+    <w:bookmarkStart w:id="144" w:name="material-log"/>
     <w:p>
       <w:pPr>
         <w:pStyle w:val="Heading2"/>
@@ -27424,8 +28547,8 @@
         <w:t xml:space="preserve">(Add more units/forms/transcripts as provided.)</w:t>
       </w:r>
     </w:p>
-    <w:bookmarkEnd w:id="143"/>
     <w:bookmarkEnd w:id="144"/>
+    <w:bookmarkEnd w:id="145"/>
     <w:sectPr/>
   </w:body>
 </w:document>

</xml_diff>